<commit_message>
added comments and small details to prereg
</commit_message>
<xml_diff>
--- a/docs/preregistration/preregistration.docx
+++ b/docs/preregistration/preregistration.docx
@@ -159,6 +159,7 @@
           <w:numId w:val="1"/>
         </w:numPr>
       </w:pPr>
+      <w:commentRangeStart w:id="1"/>
       <w:r>
         <w:rPr>
           <w:b/>
@@ -168,6 +169,15 @@
       </w:r>
       <w:r>
         <w:t>: Does not include random assignment of subjects to treatments or conditions. This usually includes correlational studies, observational studies, surveys, natural experiments, real-world evidence studies, regression discontinuity designs, and descriptive studies.</w:t>
+      </w:r>
+      <w:commentRangeEnd w:id="1"/>
+      <w:r>
+        <w:rPr>
+          <w:rStyle w:val="CommentReference"/>
+          <w:sz w:val="24"/>
+          <w:szCs w:val="24"/>
+        </w:rPr>
+        <w:commentReference w:id="1"/>
       </w:r>
     </w:p>
     <w:p>
@@ -758,7 +768,7 @@
         </w:rPr>
         <w:t>Dialectal Contact</w:t>
       </w:r>
-      <w:commentRangeStart w:id="1"/>
+      <w:commentRangeStart w:id="2"/>
       <w:r>
         <w:rPr>
           <w:b/>
@@ -767,7 +777,7 @@
         </w:rPr>
         <w:t xml:space="preserve"> questionnaire.</w:t>
       </w:r>
-      <w:commentRangeEnd w:id="1"/>
+      <w:commentRangeEnd w:id="2"/>
       <w:r>
         <w:rPr>
           <w:rStyle w:val="CommentReference"/>
@@ -777,7 +787,7 @@
           <w:szCs w:val="24"/>
           <w:lang w:val="fr-FR"/>
         </w:rPr>
-        <w:commentReference w:id="1"/>
+        <w:commentReference w:id="2"/>
       </w:r>
       <w:r>
         <w:rPr>
@@ -1196,24 +1206,149 @@
           <w:numId w:val="6"/>
         </w:numPr>
       </w:pPr>
-      <w:commentRangeStart w:id="2"/>
-      <w:r>
-        <w:t>Social network variables.</w:t>
-      </w:r>
-      <w:commentRangeEnd w:id="2"/>
+      <w:commentRangeStart w:id="3"/>
+      <w:r>
+        <w:t xml:space="preserve">Language contact variables. </w:t>
+      </w:r>
+      <w:r>
+        <w:t>Participants will first be asked whether they have any contact with different varieties of Portuguese from different regions of the world (e.g., Açores, Brazil, Portugal, and other Portuguese-speaking regions). Participants who report no contact will be classified as “</w:t>
+      </w:r>
+      <w:r>
+        <w:t>never</w:t>
+      </w:r>
+      <w:r>
+        <w:t>”</w:t>
+      </w:r>
+      <w:r>
+        <w:t xml:space="preserve">. </w:t>
+      </w:r>
+      <w:r>
+        <w:t xml:space="preserve">Participants </w:t>
+      </w:r>
+      <w:r>
+        <w:t xml:space="preserve">do </w:t>
+      </w:r>
+      <w:r>
+        <w:t xml:space="preserve">who report </w:t>
+      </w:r>
+      <w:r>
+        <w:lastRenderedPageBreak/>
+        <w:t>contact will then be asked to report their frequency of contact, measured on a 7-interval ordinal scale from “almost never” to “every day,”</w:t>
+      </w:r>
+      <w:r>
+        <w:t xml:space="preserve"> in the following contexts:</w:t>
+      </w:r>
+    </w:p>
+    <w:p>
+      <w:pPr>
+        <w:pStyle w:val="ListParagraph"/>
+        <w:numPr>
+          <w:ilvl w:val="1"/>
+          <w:numId w:val="6"/>
+        </w:numPr>
+      </w:pPr>
+      <w:r>
+        <w:t>I</w:t>
+      </w:r>
+      <w:r>
+        <w:t>n the family</w:t>
+      </w:r>
+    </w:p>
+    <w:p>
+      <w:pPr>
+        <w:pStyle w:val="ListParagraph"/>
+        <w:numPr>
+          <w:ilvl w:val="1"/>
+          <w:numId w:val="6"/>
+        </w:numPr>
+      </w:pPr>
+      <w:r>
+        <w:t>I</w:t>
+      </w:r>
+      <w:r>
+        <w:t>n the neighborhood</w:t>
+      </w:r>
+    </w:p>
+    <w:p>
+      <w:pPr>
+        <w:pStyle w:val="ListParagraph"/>
+        <w:numPr>
+          <w:ilvl w:val="1"/>
+          <w:numId w:val="6"/>
+        </w:numPr>
+      </w:pPr>
+      <w:r>
+        <w:t>In p</w:t>
+      </w:r>
+      <w:r>
+        <w:t>rofessional or student life</w:t>
+      </w:r>
+    </w:p>
+    <w:p>
+      <w:pPr>
+        <w:pStyle w:val="ListParagraph"/>
+        <w:numPr>
+          <w:ilvl w:val="1"/>
+          <w:numId w:val="6"/>
+        </w:numPr>
+      </w:pPr>
+      <w:r>
+        <w:t>I</w:t>
+      </w:r>
+      <w:r>
+        <w:t>n social life</w:t>
+      </w:r>
+    </w:p>
+    <w:p>
+      <w:pPr>
+        <w:pStyle w:val="ListParagraph"/>
+        <w:numPr>
+          <w:ilvl w:val="1"/>
+          <w:numId w:val="6"/>
+        </w:numPr>
+      </w:pPr>
+      <w:r>
+        <w:t>I</w:t>
+      </w:r>
+      <w:r>
+        <w:t>n personally consumed media, including television, movies, online videos, and related media</w:t>
+      </w:r>
+      <w:commentRangeEnd w:id="3"/>
       <w:r>
         <w:rPr>
           <w:rStyle w:val="CommentReference"/>
           <w:sz w:val="24"/>
           <w:szCs w:val="24"/>
         </w:rPr>
-        <w:commentReference w:id="2"/>
-      </w:r>
-    </w:p>
-    <w:p>
+        <w:commentReference w:id="3"/>
+      </w:r>
+    </w:p>
+    <w:p>
+      <w:pPr>
+        <w:pStyle w:val="ListParagraph"/>
+      </w:pPr>
+    </w:p>
+    <w:p>
+      <w:pPr>
+        <w:pStyle w:val="ListParagraph"/>
+        <w:numPr>
+          <w:ilvl w:val="0"/>
+          <w:numId w:val="6"/>
+        </w:numPr>
+      </w:pPr>
+      <w:commentRangeStart w:id="4"/>
       <w:r>
         <w:t>Might just say “all variables included in the sociodemographic survey attached”?</w:t>
       </w:r>
+      <w:commentRangeEnd w:id="4"/>
+      <w:r>
+        <w:rPr>
+          <w:rStyle w:val="CommentReference"/>
+          <w:sz w:val="24"/>
+          <w:szCs w:val="24"/>
+        </w:rPr>
+        <w:commentReference w:id="4"/>
+      </w:r>
     </w:p>
     <w:p>
       <w:pPr>
@@ -1232,60 +1367,60 @@
     </w:p>
     <w:p>
       <w:r>
+        <w:t>Describe how measured variables will be combined into indices or derived variables. Include a formula or precise description of the method of creating the derived variable. If your indices or derived variables are too complex to express in the response box, then upload a pdf providing a full description and use the response box to summarize it or refer the reader to the file.</w:t>
+      </w:r>
+    </w:p>
+    <w:p>
+      <w:r>
+        <w:t>INCLUDE BLP SCORER HERE.</w:t>
+      </w:r>
+    </w:p>
+    <w:p>
+      <w:pPr>
+        <w:rPr>
+          <w:b/>
+          <w:bCs/>
+        </w:rPr>
+      </w:pPr>
+      <w:r>
+        <w:rPr>
+          <w:b/>
+          <w:bCs/>
+        </w:rPr>
+        <w:t>Statistical models</w:t>
+      </w:r>
+    </w:p>
+    <w:p>
+      <w:r>
+        <w:t>Describe the statistical model that will be used to test each research question or hypothesis. Explain the type of model (e.g. ANOVA, multiple regression, SEM, etc) and the specification of the model. List each variable that will be included, all interactions, subgroup analyses, pairwise or complex contrasts, and any follow-up tests from omnibus tests. Be detailed so that others can run the same analysis with the provided information. Mention if any positive controls, negative controls, manipulation checks, convergence criteria, or tests of model assumptions will be used. If analysis of some models are contingent on controls, checks, convergence, or assumption tests, then describe the decision criteria of whether the model will or will not be used depending on those outcomes. If your statistical models are too complex to express in the response box, then upload a pdf providing a full description and use the response box to summarize it or refer the reader to the file.</w:t>
+      </w:r>
+    </w:p>
+    <w:p>
+      <w:r>
+        <w:t>Multilevel hierarchical Bayesian models w</w:t>
+      </w:r>
+      <w:r>
+        <w:t>ill be used to model the data.</w:t>
+      </w:r>
+    </w:p>
+    <w:p>
+      <w:pPr>
+        <w:rPr>
+          <w:b/>
+          <w:bCs/>
+        </w:rPr>
+      </w:pPr>
+      <w:r>
+        <w:rPr>
+          <w:b/>
+          <w:bCs/>
+        </w:rPr>
+        <w:t>Transformations</w:t>
+      </w:r>
+    </w:p>
+    <w:p>
+      <w:r>
         <w:lastRenderedPageBreak/>
-        <w:t>Describe how measured variables will be combined into indices or derived variables. Include a formula or precise description of the method of creating the derived variable. If your indices or derived variables are too complex to express in the response box, then upload a pdf providing a full description and use the response box to summarize it or refer the reader to the file.</w:t>
-      </w:r>
-    </w:p>
-    <w:p>
-      <w:r>
-        <w:t>INCLUDE BLP SCORER HERE.</w:t>
-      </w:r>
-    </w:p>
-    <w:p>
-      <w:pPr>
-        <w:rPr>
-          <w:b/>
-          <w:bCs/>
-        </w:rPr>
-      </w:pPr>
-      <w:r>
-        <w:rPr>
-          <w:b/>
-          <w:bCs/>
-        </w:rPr>
-        <w:t>Statistical models</w:t>
-      </w:r>
-    </w:p>
-    <w:p>
-      <w:r>
-        <w:t>Describe the statistical model that will be used to test each research question or hypothesis. Explain the type of model (e.g. ANOVA, multiple regression, SEM, etc) and the specification of the model. List each variable that will be included, all interactions, subgroup analyses, pairwise or complex contrasts, and any follow-up tests from omnibus tests. Be detailed so that others can run the same analysis with the provided information. Mention if any positive controls, negative controls, manipulation checks, convergence criteria, or tests of model assumptions will be used. If analysis of some models are contingent on controls, checks, convergence, or assumption tests, then describe the decision criteria of whether the model will or will not be used depending on those outcomes. If your statistical models are too complex to express in the response box, then upload a pdf providing a full description and use the response box to summarize it or refer the reader to the file.</w:t>
-      </w:r>
-    </w:p>
-    <w:p>
-      <w:r>
-        <w:t>Multilevel hierarchical Bayesian models w</w:t>
-      </w:r>
-      <w:r>
-        <w:t>ill be used to model the data.</w:t>
-      </w:r>
-    </w:p>
-    <w:p>
-      <w:pPr>
-        <w:rPr>
-          <w:b/>
-          <w:bCs/>
-        </w:rPr>
-      </w:pPr>
-      <w:r>
-        <w:rPr>
-          <w:b/>
-          <w:bCs/>
-        </w:rPr>
-        <w:t>Transformations</w:t>
-      </w:r>
-    </w:p>
-    <w:p>
-      <w:r>
         <w:t>Describe the coding scheme that will be used for categorical variables and the process of transforming, centering, or recoding data to be used in the models. If no transformations will be performed on the data, say so.</w:t>
       </w:r>
     </w:p>
@@ -1637,6 +1772,7 @@
     </w:p>
     <w:p>
       <w:r>
+        <w:lastRenderedPageBreak/>
         <w:t>Describe additional planned analyses that may be of secondary importance, exploratory, or otherwise less central to the investigation than the analyses just described.</w:t>
       </w:r>
     </w:p>
@@ -1682,7 +1818,6 @@
     </w:p>
     <w:p>
       <w:r>
-        <w:lastRenderedPageBreak/>
         <w:t>Gertken, L. M., Amengual, M., &amp; Birdsong, D. (2014). 11. assessing language dominance with the bilingual language profile. </w:t>
       </w:r>
       <w:r>
@@ -1919,7 +2054,7 @@
       </w:r>
     </w:p>
   </w:comment>
-  <w:comment w:id="1" w:author="Kendra Dickinson" w:date="2026-06-25T07:05:00Z" w:initials="KD">
+  <w:comment w:id="1" w:author="Kendra Dickinson" w:date="2026-07-06T09:33:00Z" w:initials="KD">
     <w:p>
       <w:r>
         <w:rPr>
@@ -1932,11 +2067,11 @@
           <w:sz w:val="20"/>
           <w:szCs w:val="20"/>
         </w:rPr>
-        <w:t>We can talk about this in our meeting today, but I think I've come to realize we might be better off saying "Sociodemographic questionnaire" or even "Dialect Contact Questionnaire". On reflection and additional reading, social network analysis would be awesome, but I think requires a more labor intensive community integration that we are able to do at this time. Instead, I developed the questionnaire to target reported contact with people who speak different varieties of Portuguese. It won't be as fine-grained of an analysis, but could be interesting nonetheless. We can talk!</w:t>
+        <w:t>Looking at these descriptions more, I think this is the one!</w:t>
       </w:r>
     </w:p>
   </w:comment>
-  <w:comment w:id="2" w:author="Kendra Dickinson" w:date="2026-06-25T07:07:00Z" w:initials="KD">
+  <w:comment w:id="2" w:author="Kendra Dickinson" w:date="2026-06-25T07:05:00Z" w:initials="KD">
     <w:p>
       <w:r>
         <w:rPr>
@@ -1949,109 +2084,41 @@
           <w:sz w:val="20"/>
           <w:szCs w:val="20"/>
         </w:rPr>
-        <w:t>We could change this to "Sociodemographic variables", and add:</w:t>
-      </w:r>
-    </w:p>
-    <w:p/>
-    <w:p>
+        <w:t>We can talk about this in our meeting today, but I think I've come to realize we might be better off saying "Sociodemographic questionnaire" or even "Dialect Contact Questionnaire". On reflection and additional reading, social network analysis would be awesome, but I think requires a more labor intensive community integration that we are able to do at this time. Instead, I developed the questionnaire to target reported contact with people who speak different varieties of Portuguese. It won't be as fine-grained of an analysis, but could be interesting nonetheless. We can talk!</w:t>
+      </w:r>
+    </w:p>
+  </w:comment>
+  <w:comment w:id="3" w:author="Kendra Dickinson" w:date="2026-07-06T09:44:00Z" w:initials="KD">
+    <w:p>
+      <w:r>
+        <w:rPr>
+          <w:rStyle w:val="CommentReference"/>
+        </w:rPr>
+        <w:annotationRef/>
+      </w:r>
       <w:r>
         <w:rPr>
           <w:sz w:val="20"/>
           <w:szCs w:val="20"/>
         </w:rPr>
-        <w:t>- Age</w:t>
-      </w:r>
-    </w:p>
-    <w:p>
+        <w:t>I added this, is that okay?</w:t>
+      </w:r>
+    </w:p>
+  </w:comment>
+  <w:comment w:id="4" w:author="Kendra Dickinson" w:date="2026-07-06T09:39:00Z" w:initials="KD">
+    <w:p>
+      <w:r>
+        <w:rPr>
+          <w:rStyle w:val="CommentReference"/>
+        </w:rPr>
+        <w:annotationRef/>
+      </w:r>
       <w:r>
         <w:rPr>
           <w:sz w:val="20"/>
           <w:szCs w:val="20"/>
         </w:rPr>
-        <w:t>- Gender</w:t>
-      </w:r>
-    </w:p>
-    <w:p>
-      <w:r>
-        <w:rPr>
-          <w:sz w:val="20"/>
-          <w:szCs w:val="20"/>
-        </w:rPr>
-        <w:t>- SES</w:t>
-      </w:r>
-    </w:p>
-    <w:p>
-      <w:r>
-        <w:rPr>
-          <w:sz w:val="20"/>
-          <w:szCs w:val="20"/>
-        </w:rPr>
-        <w:t>- Education</w:t>
-      </w:r>
-    </w:p>
-    <w:p/>
-    <w:p>
-      <w:r>
-        <w:rPr>
-          <w:sz w:val="20"/>
-          <w:szCs w:val="20"/>
-        </w:rPr>
-        <w:t>- Reported contact with</w:t>
-      </w:r>
-    </w:p>
-    <w:p>
-      <w:r>
-        <w:rPr>
-          <w:sz w:val="20"/>
-          <w:szCs w:val="20"/>
-        </w:rPr>
-        <w:t>- PT speakers from Azores</w:t>
-      </w:r>
-    </w:p>
-    <w:p>
-      <w:r>
-        <w:rPr>
-          <w:sz w:val="20"/>
-          <w:szCs w:val="20"/>
-        </w:rPr>
-        <w:t>- PT speakers from Brazil</w:t>
-      </w:r>
-    </w:p>
-    <w:p>
-      <w:r>
-        <w:rPr>
-          <w:sz w:val="20"/>
-          <w:szCs w:val="20"/>
-        </w:rPr>
-        <w:t>- PT speakers from Cabo Verde</w:t>
-      </w:r>
-    </w:p>
-    <w:p>
-      <w:r>
-        <w:rPr>
-          <w:sz w:val="20"/>
-          <w:szCs w:val="20"/>
-        </w:rPr>
-        <w:t>- PT speakers from Portugal</w:t>
-      </w:r>
-    </w:p>
-    <w:p>
-      <w:r>
-        <w:rPr>
-          <w:sz w:val="20"/>
-          <w:szCs w:val="20"/>
-        </w:rPr>
-        <w:t>- other PT speakers</w:t>
-      </w:r>
-    </w:p>
-    <w:p/>
-    <w:p>
-      <w:r>
-        <w:rPr>
-          <w:sz w:val="20"/>
-          <w:szCs w:val="20"/>
-        </w:rPr>
-        <w:t>(or if we don't want to specify to such detail, we could just say 'Reported frequency of contact with PT speakers from different regions/who speak different varieties' or similar)</w:t>
+        <w:t>Sure!</w:t>
       </w:r>
     </w:p>
   </w:comment>
@@ -2061,24 +2128,30 @@
 <file path=word/commentsExtended.xml><?xml version="1.0" encoding="utf-8"?>
 <w15:commentsEx xmlns:wpc="http://schemas.microsoft.com/office/word/2010/wordprocessingCanvas" xmlns:cx="http://schemas.microsoft.com/office/drawing/2014/chartex" xmlns:cx1="http://schemas.microsoft.com/office/drawing/2015/9/8/chartex" xmlns:cx2="http://schemas.microsoft.com/office/drawing/2015/10/21/chartex" xmlns:cx3="http://schemas.microsoft.com/office/drawing/2016/5/9/chartex" xmlns:cx4="http://schemas.microsoft.com/office/drawing/2016/5/10/chartex" xmlns:cx5="http://schemas.microsoft.com/office/drawing/2016/5/11/chartex" xmlns:cx6="http://schemas.microsoft.com/office/drawing/2016/5/12/chartex" xmlns:cx7="http://schemas.microsoft.com/office/drawing/2016/5/13/chartex" xmlns:cx8="http://schemas.microsoft.com/office/drawing/2016/5/14/chartex" xmlns:mc="http://schemas.openxmlformats.org/markup-compatibility/2006" xmlns:aink="http://schemas.microsoft.com/office/drawing/2016/ink" xmlns:am3d="http://schemas.microsoft.com/office/drawing/2017/model3d" xmlns:o="urn:schemas-microsoft-com:office:office" xmlns:oel="http://schemas.microsoft.com/office/2019/extlst" xmlns:r="http://schemas.openxmlformats.org/officeDocument/2006/relationships" xmlns:m="http://schemas.openxmlformats.org/officeDocument/2006/math" xmlns:v="urn:schemas-microsoft-com:vml" xmlns:wp14="http://schemas.microsoft.com/office/word/2010/wordprocessingDrawing" xmlns:wp="http://schemas.openxmlformats.org/drawingml/2006/wordprocessingDrawing" xmlns:w10="urn:schemas-microsoft-com:office:word" xmlns:w="http://schemas.openxmlformats.org/wordprocessingml/2006/main" xmlns:w14="http://schemas.microsoft.com/office/word/2010/wordml" xmlns:w15="http://schemas.microsoft.com/office/word/2012/wordml" xmlns:w16cex="http://schemas.microsoft.com/office/word/2018/wordml/cex" xmlns:w16cid="http://schemas.microsoft.com/office/word/2016/wordml/cid" xmlns:w16="http://schemas.microsoft.com/office/word/2018/wordml" xmlns:w16du="http://schemas.microsoft.com/office/word/2023/wordml/word16du" xmlns:w16sdtdh="http://schemas.microsoft.com/office/word/2020/wordml/sdtdatahash" xmlns:w16sdtfl="http://schemas.microsoft.com/office/word/2024/wordml/sdtformatlock" xmlns:w16se="http://schemas.microsoft.com/office/word/2015/wordml/symex" xmlns:wpg="http://schemas.microsoft.com/office/word/2010/wordprocessingGroup" xmlns:wpi="http://schemas.microsoft.com/office/word/2010/wordprocessingInk" xmlns:wne="http://schemas.microsoft.com/office/word/2006/wordml" xmlns:wps="http://schemas.microsoft.com/office/word/2010/wordprocessingShape" mc:Ignorable="w14 w15 w16se w16cid w16 w16cex w16sdtdh w16sdtfl w16du wp14">
   <w15:commentEx w15:paraId="2DA807FB" w15:done="0"/>
+  <w15:commentEx w15:paraId="1CA08483" w15:done="0"/>
   <w15:commentEx w15:paraId="38A24E1D" w15:done="0"/>
-  <w15:commentEx w15:paraId="60EB09FB" w15:done="0"/>
+  <w15:commentEx w15:paraId="31AA1A71" w15:done="0"/>
+  <w15:commentEx w15:paraId="4707B85A" w15:done="0"/>
 </w15:commentsEx>
 </file>
 
 <file path=word/commentsExtensible.xml><?xml version="1.0" encoding="utf-8"?>
 <w16cex:commentsExtensible xmlns:wpc="http://schemas.microsoft.com/office/word/2010/wordprocessingCanvas" xmlns:cx="http://schemas.microsoft.com/office/drawing/2014/chartex" xmlns:cx1="http://schemas.microsoft.com/office/drawing/2015/9/8/chartex" xmlns:cx2="http://schemas.microsoft.com/office/drawing/2015/10/21/chartex" xmlns:cx3="http://schemas.microsoft.com/office/drawing/2016/5/9/chartex" xmlns:cx4="http://schemas.microsoft.com/office/drawing/2016/5/10/chartex" xmlns:cx5="http://schemas.microsoft.com/office/drawing/2016/5/11/chartex" xmlns:cx6="http://schemas.microsoft.com/office/drawing/2016/5/12/chartex" xmlns:cx7="http://schemas.microsoft.com/office/drawing/2016/5/13/chartex" xmlns:cx8="http://schemas.microsoft.com/office/drawing/2016/5/14/chartex" xmlns:cr="http://schemas.microsoft.com/office/comments/2020/reactions" xmlns:mc="http://schemas.openxmlformats.org/markup-compatibility/2006" xmlns:aink="http://schemas.microsoft.com/office/drawing/2016/ink" xmlns:am3d="http://schemas.microsoft.com/office/drawing/2017/model3d" xmlns:o="urn:schemas-microsoft-com:office:office" xmlns:oel="http://schemas.microsoft.com/office/2019/extlst" xmlns:r="http://schemas.openxmlformats.org/officeDocument/2006/relationships" xmlns:m="http://schemas.openxmlformats.org/officeDocument/2006/math" xmlns:v="urn:schemas-microsoft-com:vml" xmlns:wp14="http://schemas.microsoft.com/office/word/2010/wordprocessingDrawing" xmlns:wp="http://schemas.openxmlformats.org/drawingml/2006/wordprocessingDrawing" xmlns:w10="urn:schemas-microsoft-com:office:word" xmlns:w="http://schemas.openxmlformats.org/wordprocessingml/2006/main" xmlns:w14="http://schemas.microsoft.com/office/word/2010/wordml" xmlns:w15="http://schemas.microsoft.com/office/word/2012/wordml" xmlns:w16cex="http://schemas.microsoft.com/office/word/2018/wordml/cex" xmlns:w16cid="http://schemas.microsoft.com/office/word/2016/wordml/cid" xmlns:w16="http://schemas.microsoft.com/office/word/2018/wordml" xmlns:w16du="http://schemas.microsoft.com/office/word/2023/wordml/word16du" xmlns:w16sdtdh="http://schemas.microsoft.com/office/word/2020/wordml/sdtdatahash" xmlns:w16sdtfl="http://schemas.microsoft.com/office/word/2024/wordml/sdtformatlock" xmlns:w16se="http://schemas.microsoft.com/office/word/2015/wordml/symex" xmlns:wpg="http://schemas.microsoft.com/office/word/2010/wordprocessingGroup" xmlns:wpi="http://schemas.microsoft.com/office/word/2010/wordprocessingInk" xmlns:wne="http://schemas.microsoft.com/office/word/2006/wordml" xmlns:wps="http://schemas.microsoft.com/office/word/2010/wordprocessingShape" mc:Ignorable="w14 w15 w16se w16cid w16 w16cex w16sdtdh w16sdtfl cr w16du wp14">
   <w16cex:commentExtensible w16cex:durableId="1434D524" w16cex:dateUtc="2026-06-25T11:13:00Z"/>
+  <w16cex:commentExtensible w16cex:durableId="74F17809" w16cex:dateUtc="2026-07-06T13:33:00Z"/>
   <w16cex:commentExtensible w16cex:durableId="6554F1C6" w16cex:dateUtc="2026-06-25T11:05:00Z"/>
-  <w16cex:commentExtensible w16cex:durableId="3025FFF7" w16cex:dateUtc="2026-06-25T11:07:00Z"/>
+  <w16cex:commentExtensible w16cex:durableId="4CD04021" w16cex:dateUtc="2026-07-06T13:44:00Z"/>
+  <w16cex:commentExtensible w16cex:durableId="01B036C6" w16cex:dateUtc="2026-07-06T13:39:00Z"/>
 </w16cex:commentsExtensible>
 </file>
 
 <file path=word/commentsIds.xml><?xml version="1.0" encoding="utf-8"?>
 <w16cid:commentsIds xmlns:wpc="http://schemas.microsoft.com/office/word/2010/wordprocessingCanvas" xmlns:cx="http://schemas.microsoft.com/office/drawing/2014/chartex" xmlns:cx1="http://schemas.microsoft.com/office/drawing/2015/9/8/chartex" xmlns:cx2="http://schemas.microsoft.com/office/drawing/2015/10/21/chartex" xmlns:cx3="http://schemas.microsoft.com/office/drawing/2016/5/9/chartex" xmlns:cx4="http://schemas.microsoft.com/office/drawing/2016/5/10/chartex" xmlns:cx5="http://schemas.microsoft.com/office/drawing/2016/5/11/chartex" xmlns:cx6="http://schemas.microsoft.com/office/drawing/2016/5/12/chartex" xmlns:cx7="http://schemas.microsoft.com/office/drawing/2016/5/13/chartex" xmlns:cx8="http://schemas.microsoft.com/office/drawing/2016/5/14/chartex" xmlns:mc="http://schemas.openxmlformats.org/markup-compatibility/2006" xmlns:aink="http://schemas.microsoft.com/office/drawing/2016/ink" xmlns:am3d="http://schemas.microsoft.com/office/drawing/2017/model3d" xmlns:o="urn:schemas-microsoft-com:office:office" xmlns:oel="http://schemas.microsoft.com/office/2019/extlst" xmlns:r="http://schemas.openxmlformats.org/officeDocument/2006/relationships" xmlns:m="http://schemas.openxmlformats.org/officeDocument/2006/math" xmlns:v="urn:schemas-microsoft-com:vml" xmlns:wp14="http://schemas.microsoft.com/office/word/2010/wordprocessingDrawing" xmlns:wp="http://schemas.openxmlformats.org/drawingml/2006/wordprocessingDrawing" xmlns:w10="urn:schemas-microsoft-com:office:word" xmlns:w="http://schemas.openxmlformats.org/wordprocessingml/2006/main" xmlns:w14="http://schemas.microsoft.com/office/word/2010/wordml" xmlns:w15="http://schemas.microsoft.com/office/word/2012/wordml" xmlns:w16cex="http://schemas.microsoft.com/office/word/2018/wordml/cex" xmlns:w16cid="http://schemas.microsoft.com/office/word/2016/wordml/cid" xmlns:w16="http://schemas.microsoft.com/office/word/2018/wordml" xmlns:w16du="http://schemas.microsoft.com/office/word/2023/wordml/word16du" xmlns:w16sdtdh="http://schemas.microsoft.com/office/word/2020/wordml/sdtdatahash" xmlns:w16sdtfl="http://schemas.microsoft.com/office/word/2024/wordml/sdtformatlock" xmlns:w16se="http://schemas.microsoft.com/office/word/2015/wordml/symex" xmlns:wpg="http://schemas.microsoft.com/office/word/2010/wordprocessingGroup" xmlns:wpi="http://schemas.microsoft.com/office/word/2010/wordprocessingInk" xmlns:wne="http://schemas.microsoft.com/office/word/2006/wordml" xmlns:wps="http://schemas.microsoft.com/office/word/2010/wordprocessingShape" mc:Ignorable="w14 w15 w16se w16cid w16 w16cex w16sdtdh w16sdtfl w16du wp14">
   <w16cid:commentId w16cid:paraId="2DA807FB" w16cid:durableId="1434D524"/>
+  <w16cid:commentId w16cid:paraId="1CA08483" w16cid:durableId="74F17809"/>
   <w16cid:commentId w16cid:paraId="38A24E1D" w16cid:durableId="6554F1C6"/>
-  <w16cid:commentId w16cid:paraId="60EB09FB" w16cid:durableId="3025FFF7"/>
+  <w16cid:commentId w16cid:paraId="31AA1A71" w16cid:durableId="4CD04021"/>
+  <w16cid:commentId w16cid:paraId="4707B85A" w16cid:durableId="01B036C6"/>
 </w16cid:commentsIds>
 </file>
 
@@ -3411,6 +3484,7 @@
   <w:style w:type="character" w:default="1" w:styleId="DefaultParagraphFont">
     <w:name w:val="Default Paragraph Font"/>
     <w:uiPriority w:val="1"/>
+    <w:semiHidden/>
     <w:unhideWhenUsed/>
   </w:style>
   <w:style w:type="table" w:default="1" w:styleId="TableNormal">

</xml_diff>

<commit_message>
rhotic analysis, pre reg
added some info for rhotic analysis, finalized final draft of pre reg.
</commit_message>
<xml_diff>
--- a/docs/preregistration/preregistration.docx
+++ b/docs/preregistration/preregistration.docx
@@ -1,6 +1,6 @@
 
 <file path=word/document.xml><?xml version="1.0" encoding="utf-8"?>
-<w:document xmlns:wpc="http://schemas.microsoft.com/office/word/2010/wordprocessingCanvas" xmlns:cx="http://schemas.microsoft.com/office/drawing/2014/chartex" xmlns:cx1="http://schemas.microsoft.com/office/drawing/2015/9/8/chartex" xmlns:cx2="http://schemas.microsoft.com/office/drawing/2015/10/21/chartex" xmlns:cx3="http://schemas.microsoft.com/office/drawing/2016/5/9/chartex" xmlns:cx4="http://schemas.microsoft.com/office/drawing/2016/5/10/chartex" xmlns:cx5="http://schemas.microsoft.com/office/drawing/2016/5/11/chartex" xmlns:cx6="http://schemas.microsoft.com/office/drawing/2016/5/12/chartex" xmlns:cx7="http://schemas.microsoft.com/office/drawing/2016/5/13/chartex" xmlns:cx8="http://schemas.microsoft.com/office/drawing/2016/5/14/chartex" xmlns:mc="http://schemas.openxmlformats.org/markup-compatibility/2006" xmlns:aink="http://schemas.microsoft.com/office/drawing/2016/ink" xmlns:am3d="http://schemas.microsoft.com/office/drawing/2017/model3d" xmlns:o="urn:schemas-microsoft-com:office:office" xmlns:oel="http://schemas.microsoft.com/office/2019/extlst" xmlns:r="http://schemas.openxmlformats.org/officeDocument/2006/relationships" xmlns:m="http://schemas.openxmlformats.org/officeDocument/2006/math" xmlns:v="urn:schemas-microsoft-com:vml" xmlns:wp14="http://schemas.microsoft.com/office/word/2010/wordprocessingDrawing" xmlns:wp="http://schemas.openxmlformats.org/drawingml/2006/wordprocessingDrawing" xmlns:w10="urn:schemas-microsoft-com:office:word" xmlns:w="http://schemas.openxmlformats.org/wordprocessingml/2006/main" xmlns:w14="http://schemas.microsoft.com/office/word/2010/wordml" xmlns:w15="http://schemas.microsoft.com/office/word/2012/wordml" xmlns:w16cex="http://schemas.microsoft.com/office/word/2018/wordml/cex" xmlns:w16cid="http://schemas.microsoft.com/office/word/2016/wordml/cid" xmlns:w16="http://schemas.microsoft.com/office/word/2018/wordml" xmlns:w16du="http://schemas.microsoft.com/office/word/2023/wordml/word16du" xmlns:w16sdtdh="http://schemas.microsoft.com/office/word/2020/wordml/sdtdatahash" xmlns:w16sdtfl="http://schemas.microsoft.com/office/word/2024/wordml/sdtformatlock" xmlns:w16se="http://schemas.microsoft.com/office/word/2015/wordml/symex" xmlns:wpg="http://schemas.microsoft.com/office/word/2010/wordprocessingGroup" xmlns:wpi="http://schemas.microsoft.com/office/word/2010/wordprocessingInk" xmlns:wne="http://schemas.microsoft.com/office/word/2006/wordml" xmlns:wps="http://schemas.microsoft.com/office/word/2010/wordprocessingShape" mc:Ignorable="w14 w15 w16se w16cid w16 w16cex w16sdtdh w16sdtfl w16du wp14">
+<w:document xmlns:wpc="http://schemas.microsoft.com/office/word/2010/wordprocessingCanvas" xmlns:cx="http://schemas.microsoft.com/office/drawing/2014/chartex" xmlns:cx1="http://schemas.microsoft.com/office/drawing/2015/9/8/chartex" xmlns:cx2="http://schemas.microsoft.com/office/drawing/2015/10/21/chartex" xmlns:cx3="http://schemas.microsoft.com/office/drawing/2016/5/9/chartex" xmlns:cx4="http://schemas.microsoft.com/office/drawing/2016/5/10/chartex" xmlns:cx5="http://schemas.microsoft.com/office/drawing/2016/5/11/chartex" xmlns:cx6="http://schemas.microsoft.com/office/drawing/2016/5/12/chartex" xmlns:cx7="http://schemas.microsoft.com/office/drawing/2016/5/13/chartex" xmlns:cx8="http://schemas.microsoft.com/office/drawing/2016/5/14/chartex" xmlns:mc="http://schemas.openxmlformats.org/markup-compatibility/2006" xmlns:aink="http://schemas.microsoft.com/office/drawing/2016/ink" xmlns:am3d="http://schemas.microsoft.com/office/drawing/2017/model3d" xmlns:o="urn:schemas-microsoft-com:office:office" xmlns:oel="http://schemas.microsoft.com/office/2019/extlst" xmlns:r="http://schemas.openxmlformats.org/officeDocument/2006/relationships" xmlns:m="http://schemas.openxmlformats.org/officeDocument/2006/math" xmlns:v="urn:schemas-microsoft-com:vml" xmlns:wp14="http://schemas.microsoft.com/office/word/2010/wordprocessingDrawing" xmlns:wp="http://schemas.openxmlformats.org/drawingml/2006/wordprocessingDrawing" xmlns:w10="urn:schemas-microsoft-com:office:word" xmlns:w="http://schemas.openxmlformats.org/wordprocessingml/2006/main" xmlns:w14="http://schemas.microsoft.com/office/word/2010/wordml" xmlns:w15="http://schemas.microsoft.com/office/word/2012/wordml" xmlns:w16cei="http://schemas.microsoft.com/office/word/2026/wordml/cei" xmlns:w16cex="http://schemas.microsoft.com/office/word/2018/wordml/cex" xmlns:w16cid="http://schemas.microsoft.com/office/word/2016/wordml/cid" xmlns:w16="http://schemas.microsoft.com/office/word/2018/wordml" xmlns:w16du="http://schemas.microsoft.com/office/word/2023/wordml/word16du" xmlns:w16sdtdh="http://schemas.microsoft.com/office/word/2020/wordml/sdtdatahash" xmlns:w16sdtfl="http://schemas.microsoft.com/office/word/2024/wordml/sdtformatlock" xmlns:w16se="http://schemas.microsoft.com/office/word/2015/wordml/symex" xmlns:wpg="http://schemas.microsoft.com/office/word/2010/wordprocessingGroup" xmlns:wpi="http://schemas.microsoft.com/office/word/2010/wordprocessingInk" xmlns:wne="http://schemas.microsoft.com/office/word/2006/wordml" xmlns:wps="http://schemas.microsoft.com/office/word/2010/wordprocessingShape" mc:Ignorable="w14 w15 w16se w16cid w16 w16cex w16sdtdh w16sdtfl w16du wp14">
   <w:body>
     <w:p>
       <w:r>
@@ -42,7 +42,19 @@
         <w:t>RHOTICS AND HERITAGE SPEAKERS</w:t>
       </w:r>
       <w:r>
-        <w:t>: Do heritage speakers of Portuguese in Newark pattern in rhotic realization with their population of origin?</w:t>
+        <w:t>: Do heritage speakers of Portuguese in Newark pattern in rhotic realization with their</w:t>
+      </w:r>
+      <w:r>
+        <w:t xml:space="preserve"> </w:t>
+      </w:r>
+      <w:r>
+        <w:t xml:space="preserve">population of </w:t>
+      </w:r>
+      <w:r>
+        <w:t xml:space="preserve">geographic </w:t>
+      </w:r>
+      <w:r>
+        <w:t>origin?</w:t>
       </w:r>
     </w:p>
     <w:p>
@@ -61,7 +73,13 @@
         <w:t>GEOGRAPHIC ORIGINS OF LUSOPHONES IN NEWARK</w:t>
       </w:r>
       <w:r>
-        <w:t>: What geographic origins does the lusophone population in Newark have?</w:t>
+        <w:t>: What geographic origins do</w:t>
+      </w:r>
+      <w:r>
+        <w:t xml:space="preserve"> </w:t>
+      </w:r>
+      <w:r>
+        <w:t>the lusophone population in Newark have?</w:t>
       </w:r>
     </w:p>
     <w:p>
@@ -104,7 +122,19 @@
         <w:t xml:space="preserve">: </w:t>
       </w:r>
       <w:r>
-        <w:t>To what extend do Portuguese speakers in Newark report contact with speakers of other varieties of Portuguese?</w:t>
+        <w:t>To what exten</w:t>
+      </w:r>
+      <w:r>
+        <w:t>t</w:t>
+      </w:r>
+      <w:r>
+        <w:t xml:space="preserve"> do Portuguese speakers in Newark</w:t>
+      </w:r>
+      <w:r>
+        <w:t>, New Jersey</w:t>
+      </w:r>
+      <w:r>
+        <w:t xml:space="preserve"> report contact with speakers of other varieties of Portuguese?</w:t>
       </w:r>
     </w:p>
     <w:p>
@@ -660,7 +690,13 @@
     </w:p>
     <w:p>
       <w:r>
-        <w:t>Participants will complete four tasks.</w:t>
+        <w:t xml:space="preserve">Participants will complete </w:t>
+      </w:r>
+      <w:r>
+        <w:t>five</w:t>
+      </w:r>
+      <w:r>
+        <w:t xml:space="preserve"> tasks.</w:t>
       </w:r>
     </w:p>
     <w:p>
@@ -679,7 +715,19 @@
         <w:t>Storytelling task.</w:t>
       </w:r>
       <w:r>
-        <w:t xml:space="preserve"> Participants will first use a series of illustrations to tell a story. The illustrations, borrowed with permission from Hurtado (2022), are based on the folktale Little Red Riding Hood. Participants will view the illustrations using Microsoft PowerPoint on a personal computer and narrate the story aloud. They will have full control to move forward or backward as desired. This type of task has been used in previous studies on Spanish-English bilingualism in the USA (</w:t>
+        <w:t xml:space="preserve"> Participants will first use a series of illustrations to tell a story. The illustrations, borrowed with permission from Hurtado (2022), are based on the folktale Little Red Riding Hood. Participants will view the illustrations</w:t>
+      </w:r>
+      <w:r>
+        <w:t xml:space="preserve"> in a slideshow </w:t>
+      </w:r>
+      <w:r>
+        <w:t>on a personal computer and narrate the story aloud. They will have full control to move forward or backward as desired</w:t>
+      </w:r>
+      <w:r>
+        <w:t xml:space="preserve"> and will be recorded the entire time</w:t>
+      </w:r>
+      <w:r>
+        <w:t>. This type of task has been used in previous studies on Spanish-English bilingualism in the USA (</w:t>
       </w:r>
       <w:r>
         <w:rPr>
@@ -711,6 +759,9 @@
       <w:r>
         <w:t xml:space="preserve"> </w:t>
       </w:r>
+      <w:r>
+        <w:t>Participants will view a slideshow displaying a sentence and a corresponding image. The target word in each sentence will be replaced with a line “____”, corresponding to the length of the word. They will be instructed that the missing word will be common and to use their first instinct. They will first read the sentence to themselves, think of how they would complete the sentence, and then say the sentence aloud with the completed word. If the participant does not produce the target word, the researcher will provide the word for them.</w:t>
+      </w:r>
     </w:p>
     <w:p>
       <w:pPr>
@@ -764,7 +815,6 @@
         <w:rPr>
           <w:b/>
           <w:bCs/>
-          <w:lang w:val="fr-FR"/>
         </w:rPr>
         <w:t>Dialectal Contact</w:t>
       </w:r>
@@ -773,7 +823,6 @@
         <w:rPr>
           <w:b/>
           <w:bCs/>
-          <w:lang w:val="fr-FR"/>
         </w:rPr>
         <w:t xml:space="preserve"> questionnaire.</w:t>
       </w:r>
@@ -785,7 +834,6 @@
           <w:bCs/>
           <w:sz w:val="24"/>
           <w:szCs w:val="24"/>
-          <w:lang w:val="fr-FR"/>
         </w:rPr>
         <w:commentReference w:id="2"/>
       </w:r>
@@ -793,7 +841,6 @@
         <w:rPr>
           <w:b/>
           <w:bCs/>
-          <w:lang w:val="fr-FR"/>
         </w:rPr>
         <w:t xml:space="preserve"> </w:t>
       </w:r>
@@ -806,6 +853,42 @@
       <w:r>
         <w:t>the quantity of contact they have with different varieties of Portuguese and where that contact occurs.</w:t>
       </w:r>
+      <w:r>
+        <w:t xml:space="preserve"> See attached document for the questionnaire created for this study.</w:t>
+      </w:r>
+    </w:p>
+    <w:p>
+      <w:pPr>
+        <w:pStyle w:val="ListParagraph"/>
+        <w:numPr>
+          <w:ilvl w:val="0"/>
+          <w:numId w:val="4"/>
+        </w:numPr>
+      </w:pPr>
+      <w:r>
+        <w:rPr>
+          <w:b/>
+          <w:bCs/>
+        </w:rPr>
+        <w:t>Lext-</w:t>
+      </w:r>
+      <w:r>
+        <w:rPr>
+          <w:b/>
+          <w:bCs/>
+        </w:rPr>
+        <w:t>PT</w:t>
+      </w:r>
+      <w:r>
+        <w:rPr>
+          <w:b/>
+          <w:bCs/>
+        </w:rPr>
+        <w:t>.</w:t>
+      </w:r>
+      <w:r>
+        <w:t xml:space="preserve"> Participants will complete the Lext-PT (Zhou &amp; Li, 2022).</w:t>
+      </w:r>
     </w:p>
     <w:p>
       <w:pPr>
@@ -824,16 +907,22 @@
     </w:p>
     <w:p>
       <w:r>
-        <w:t>Describe the process by which you will define your sampling strategy and collect new data or gather and prepare existing data. This can include the relevant population from which you will sample, the sampling frame, the recruiting method, the inclusion and exclusion criteria for eligibility to be in the sample, the source or location of the sample (e.g., geographic region for people, batch numbers for reagents), and the expected duration of data collection. If your data collection procedure is too complex to express in the response box, then upload a pdf providing a full description and use the response box to summarize it or refer the reader to the file.</w:t>
-      </w:r>
-    </w:p>
-    <w:p>
-      <w:r>
-        <w:t xml:space="preserve">Participants will be recruited primarily through flyers in Portuguese posted in Newark and snowball sampling. The flyer (with its English translation) is attached. Flyers will be posted </w:t>
+        <w:t xml:space="preserve">Describe the process by which you will define your sampling strategy and collect new data or gather and prepare existing data. This can include the relevant population from which </w:t>
       </w:r>
       <w:r>
         <w:lastRenderedPageBreak/>
-        <w:t>in culturally-relevant spots that are frequented by Portuguese speakers, such as cafes and social clubs.</w:t>
+        <w:t>you will sample, the sampling frame, the recruiting method, the inclusion and exclusion criteria for eligibility to be in the sample, the source or location of the sample (e.g., geographic region for people, batch numbers for reagents), and the expected duration of data collection. If your data collection procedure is too complex to express in the response box, then upload a pdf providing a full description and use the response box to summarize it or refer the reader to the file.</w:t>
+      </w:r>
+    </w:p>
+    <w:p>
+      <w:r>
+        <w:t>Participants will be recruited primarily through flyers in Portuguese posted in Newark</w:t>
+      </w:r>
+      <w:r>
+        <w:t>, New Jersey</w:t>
+      </w:r>
+      <w:r>
+        <w:t xml:space="preserve"> and snowball sampling. The flyer (with its English translation) is attached. Flyers will be posted in culturally-relevant spots that are frequented by Portuguese speakers, such as cafes and social clubs.</w:t>
       </w:r>
     </w:p>
     <w:p>
@@ -940,16 +1029,38 @@
     </w:p>
     <w:p>
       <w:r>
-        <w:t xml:space="preserve">Pilot testing will include up to and including the fifth participant. The sixth participant and beyond will constitute data collection. </w:t>
-      </w:r>
-      <w:r>
-        <w:t>Data collection will terminate in January 2027 if data from the minimum number of participants, 30, has been collected. If the minimum number has not been found, data collection will continue into 2027</w:t>
+        <w:t xml:space="preserve">Pilot testing will include up to and including the </w:t>
+      </w:r>
+      <w:r>
+        <w:t>second</w:t>
+      </w:r>
+      <w:r>
+        <w:t xml:space="preserve"> participant. The </w:t>
+      </w:r>
+      <w:r>
+        <w:t>third</w:t>
+      </w:r>
+      <w:r>
+        <w:t xml:space="preserve"> participant and beyond will constitute data collection. </w:t>
+      </w:r>
+      <w:r>
+        <w:t xml:space="preserve">Data collection will terminate in January 2027 if </w:t>
+      </w:r>
+      <w:r>
+        <w:lastRenderedPageBreak/>
+        <w:t>data from the minimum number of participants, 30, has been collected. If the minimum number has not been found, data collection will continue into 2027</w:t>
       </w:r>
       <w:r>
         <w:t xml:space="preserve"> until data from at least 30 participants has been collected</w:t>
       </w:r>
       <w:r>
-        <w:t>. During the data collection period, from September 2026 to January 2027, there will be no restriction on maximum number of participants.</w:t>
+        <w:t xml:space="preserve">. During the </w:t>
+      </w:r>
+      <w:r>
+        <w:t xml:space="preserve">initial </w:t>
+      </w:r>
+      <w:r>
+        <w:t>data collection period, from September 2026 to January 2027, there will be no restriction on maximum number of participants.</w:t>
       </w:r>
     </w:p>
     <w:p>
@@ -969,11 +1080,7 @@
     </w:p>
     <w:p>
       <w:r>
-        <w:t xml:space="preserve">Describe all manipulated variables and the levels or treatment arms. If the investigation has no randomization, then respond none. If your manipulated variables are too complex to </w:t>
-      </w:r>
-      <w:r>
-        <w:lastRenderedPageBreak/>
-        <w:t>express in the response box, then upload a pdf providing a full description and use the response box to summarize it or refer the reader to the file.</w:t>
+        <w:t>Describe all manipulated variables and the levels or treatment arms. If the investigation has no randomization, then respond none. If your manipulated variables are too complex to express in the response box, then upload a pdf providing a full description and use the response box to summarize it or refer the reader to the file.</w:t>
       </w:r>
     </w:p>
     <w:p>
@@ -1003,7 +1110,13 @@
     </w:p>
     <w:p>
       <w:r>
-        <w:t>The present study has been designed to investigate rhotic realization in Portuguese speakers of Newark.</w:t>
+        <w:t>The present study has been designed to investigate rhotic realization in Portuguese speakers of Newark</w:t>
+      </w:r>
+      <w:r>
+        <w:t>, New Jersey</w:t>
+      </w:r>
+      <w:r>
+        <w:t>.</w:t>
       </w:r>
     </w:p>
     <w:p>
@@ -1147,6 +1260,7 @@
         </w:numPr>
       </w:pPr>
       <w:r>
+        <w:lastRenderedPageBreak/>
         <w:t>Years in immersion variables. These variables will be treated as continuous.</w:t>
       </w:r>
     </w:p>
@@ -1208,35 +1322,7 @@
       </w:pPr>
       <w:commentRangeStart w:id="3"/>
       <w:r>
-        <w:t xml:space="preserve">Language contact variables. </w:t>
-      </w:r>
-      <w:r>
-        <w:t>Participants will first be asked whether they have any contact with different varieties of Portuguese from different regions of the world (e.g., Açores, Brazil, Portugal, and other Portuguese-speaking regions). Participants who report no contact will be classified as “</w:t>
-      </w:r>
-      <w:r>
-        <w:t>never</w:t>
-      </w:r>
-      <w:r>
-        <w:t>”</w:t>
-      </w:r>
-      <w:r>
-        <w:t xml:space="preserve">. </w:t>
-      </w:r>
-      <w:r>
-        <w:t xml:space="preserve">Participants </w:t>
-      </w:r>
-      <w:r>
-        <w:t xml:space="preserve">do </w:t>
-      </w:r>
-      <w:r>
-        <w:t xml:space="preserve">who report </w:t>
-      </w:r>
-      <w:r>
-        <w:lastRenderedPageBreak/>
-        <w:t>contact will then be asked to report their frequency of contact, measured on a 7-interval ordinal scale from “almost never” to “every day,”</w:t>
-      </w:r>
-      <w:r>
-        <w:t xml:space="preserve"> in the following contexts:</w:t>
+        <w:t>Language contact variables. Participants will first be asked whether they have any contact with different varieties of Portuguese from different regions of the world (e.g., Açores, Brazil, Portugal, and other Portuguese-speaking regions). Participants who report no contact will be classified as “never”. Participants do who report contact will then be asked to report their frequency of contact, measured on a 7-interval ordinal scale from “almost never” to “every day,” in the following contexts:</w:t>
       </w:r>
     </w:p>
     <w:p>
@@ -1248,10 +1334,7 @@
         </w:numPr>
       </w:pPr>
       <w:r>
-        <w:t>I</w:t>
-      </w:r>
-      <w:r>
-        <w:t>n the family</w:t>
+        <w:t>In the family</w:t>
       </w:r>
     </w:p>
     <w:p>
@@ -1263,10 +1346,7 @@
         </w:numPr>
       </w:pPr>
       <w:r>
-        <w:t>I</w:t>
-      </w:r>
-      <w:r>
-        <w:t>n the neighborhood</w:t>
+        <w:t>In the neighborhood</w:t>
       </w:r>
     </w:p>
     <w:p>
@@ -1278,10 +1358,7 @@
         </w:numPr>
       </w:pPr>
       <w:r>
-        <w:t>In p</w:t>
-      </w:r>
-      <w:r>
-        <w:t>rofessional or student life</w:t>
+        <w:t>In professional or student life</w:t>
       </w:r>
     </w:p>
     <w:p>
@@ -1293,10 +1370,7 @@
         </w:numPr>
       </w:pPr>
       <w:r>
-        <w:t>I</w:t>
-      </w:r>
-      <w:r>
-        <w:t>n social life</w:t>
+        <w:t>In social life</w:t>
       </w:r>
     </w:p>
     <w:p>
@@ -1308,10 +1382,7 @@
         </w:numPr>
       </w:pPr>
       <w:r>
-        <w:t>I</w:t>
-      </w:r>
-      <w:r>
-        <w:t>n personally consumed media, including television, movies, online videos, and related media</w:t>
+        <w:t>In personally consumed media, including television, movies, online videos, and related media</w:t>
       </w:r>
       <w:commentRangeEnd w:id="3"/>
       <w:r>
@@ -1336,9 +1407,12 @@
           <w:numId w:val="6"/>
         </w:numPr>
       </w:pPr>
+      <w:r>
+        <w:t>A</w:t>
+      </w:r>
       <w:commentRangeStart w:id="4"/>
       <w:r>
-        <w:t>Might just say “all variables included in the sociodemographic survey attached”?</w:t>
+        <w:t>ll variables included in the sociodemographic survey attached</w:t>
       </w:r>
       <w:commentRangeEnd w:id="4"/>
       <w:r>
@@ -1372,7 +1446,21 @@
     </w:p>
     <w:p>
       <w:r>
-        <w:t>INCLUDE BLP SCORER HERE.</w:t>
+        <w:t xml:space="preserve">The BLP will be scored according to the scoring system defined here: </w:t>
+      </w:r>
+      <w:hyperlink r:id="rId9" w:history="1">
+        <w:r>
+          <w:rPr>
+            <w:rStyle w:val="Hyperlink"/>
+          </w:rPr>
+          <w:t>https://blp.coerll.utexas.edu/using-the-blp/</w:t>
+        </w:r>
+      </w:hyperlink>
+      <w:r>
+        <w:t>.</w:t>
+      </w:r>
+      <w:r>
+        <w:t xml:space="preserve"> A custom script was written, attached, to score the BLP for the current study.</w:t>
       </w:r>
     </w:p>
     <w:p>
@@ -1392,15 +1480,31 @@
     </w:p>
     <w:p>
       <w:r>
-        <w:t>Describe the statistical model that will be used to test each research question or hypothesis. Explain the type of model (e.g. ANOVA, multiple regression, SEM, etc) and the specification of the model. List each variable that will be included, all interactions, subgroup analyses, pairwise or complex contrasts, and any follow-up tests from omnibus tests. Be detailed so that others can run the same analysis with the provided information. Mention if any positive controls, negative controls, manipulation checks, convergence criteria, or tests of model assumptions will be used. If analysis of some models are contingent on controls, checks, convergence, or assumption tests, then describe the decision criteria of whether the model will or will not be used depending on those outcomes. If your statistical models are too complex to express in the response box, then upload a pdf providing a full description and use the response box to summarize it or refer the reader to the file.</w:t>
-      </w:r>
-    </w:p>
-    <w:p>
-      <w:r>
-        <w:t>Multilevel hierarchical Bayesian models w</w:t>
-      </w:r>
-      <w:r>
-        <w:t>ill be used to model the data.</w:t>
+        <w:t xml:space="preserve">Describe the statistical model that will be used to test each research question or hypothesis. Explain the type of model (e.g. ANOVA, multiple regression, SEM, etc) and the specification of the model. List each variable that will be included, all interactions, subgroup analyses, pairwise or complex contrasts, and any follow-up tests from omnibus tests. Be detailed so that others can run the same analysis with the provided information. Mention if any positive controls, negative controls, manipulation checks, convergence </w:t>
+      </w:r>
+      <w:r>
+        <w:lastRenderedPageBreak/>
+        <w:t>criteria, or tests of model assumptions will be used. If analysis of some models are contingent on controls, checks, convergence, or assumption tests, then describe the decision criteria of whether the model will or will not be used depending on those outcomes. If your statistical models are too complex to express in the response box, then upload a pdf providing a full description and use the response box to summarize it or refer the reader to the file.</w:t>
+      </w:r>
+    </w:p>
+    <w:p>
+      <w:r>
+        <w:t>M</w:t>
+      </w:r>
+      <w:r>
+        <w:t>ultilevel hierarchical Bayesian model</w:t>
+      </w:r>
+      <w:r>
+        <w:t>s</w:t>
+      </w:r>
+      <w:r>
+        <w:t xml:space="preserve"> w</w:t>
+      </w:r>
+      <w:r>
+        <w:t>ill be used to model</w:t>
+      </w:r>
+      <w:r>
+        <w:t xml:space="preserve"> the data.</w:t>
       </w:r>
     </w:p>
     <w:p>
@@ -1420,13 +1524,17 @@
     </w:p>
     <w:p>
       <w:r>
-        <w:lastRenderedPageBreak/>
         <w:t>Describe the coding scheme that will be used for categorical variables and the process of transforming, centering, or recoding data to be used in the models. If no transformations will be performed on the data, say so.</w:t>
       </w:r>
     </w:p>
     <w:p>
       <w:r>
-        <w:t xml:space="preserve">All continuous variables will be z-scored. </w:t>
+        <w:t>All continuous variables will be z-scored.</w:t>
+      </w:r>
+    </w:p>
+    <w:p>
+      <w:r>
+        <w:t>Formant values will be extracted at 10% points for sonorous segments and averaged to produce a single-point value.</w:t>
       </w:r>
     </w:p>
     <w:p>
@@ -1695,7 +1803,17 @@
           <w:szCs w:val="20"/>
         </w:rPr>
         <w:br/>
-        <w:t>All speakers of Portuguese who are over the age of 18, have the capacity to consent, live in New Jersey or have substantial ties to a Portuguese-speaking community in New Jersey, and can participate in the study procedures are eligible to participate. Potential participants will be screened for these criteria by study personnel.</w:t>
+        <w:t xml:space="preserve">All speakers of Portuguese who are over the age of 18, have the capacity to consent, live in New Jersey or have substantial ties to a Portuguese-speaking community in New Jersey, and can </w:t>
+      </w:r>
+      <w:r>
+        <w:rPr>
+          <w:rFonts w:ascii="Palatino Linotype" w:hAnsi="Palatino Linotype"/>
+          <w:color w:val="000000" w:themeColor="text1"/>
+          <w:sz w:val="20"/>
+          <w:szCs w:val="20"/>
+        </w:rPr>
+        <w:lastRenderedPageBreak/>
+        <w:t>participate in the study procedures are eligible to participate. Potential participants will be screened for these criteria by study personnel.</w:t>
       </w:r>
     </w:p>
     <w:p>
@@ -1772,7 +1890,6 @@
     </w:p>
     <w:p>
       <w:r>
-        <w:lastRenderedPageBreak/>
         <w:t>Describe additional planned analyses that may be of secondary importance, exploratory, or otherwise less central to the investigation than the analyses just described.</w:t>
       </w:r>
     </w:p>
@@ -1818,45 +1935,45 @@
     </w:p>
     <w:p>
       <w:r>
-        <w:t>Gertken, L. M., Amengual, M., &amp; Birdsong, D. (2014). 11. assessing language dominance with the bilingual language profile. </w:t>
+        <w:t xml:space="preserve">Cuza, A., Pérez-Tattam, R., Barajas, E., Miller, L., &amp; Sadowski, C. (2013). </w:t>
+      </w:r>
+      <w:r>
+        <w:t>The development of tense and aspect morphology in child and adult heritage speakers. </w:t>
       </w:r>
       <w:r>
         <w:rPr>
           <w:i/>
           <w:iCs/>
         </w:rPr>
-        <w:t>Measuring L2 proficiency: Perspectives from SLA</w:t>
-      </w:r>
-      <w:r>
-        <w:t>, 208-225.</w:t>
-      </w:r>
-    </w:p>
-    <w:p>
-      <w:r>
-        <w:t xml:space="preserve">Cuza, A., Pérez-Tattam, R., Barajas, E., Miller, L., &amp; Sadowski, C. (2013). </w:t>
-      </w:r>
-      <w:r>
-        <w:t>The development of tense and aspect morphology in child and adult heritage speakers. </w:t>
+        <w:t>Innovative research and practices in second language acquisition and bilingualism</w:t>
+      </w:r>
+      <w:r>
+        <w:t>, </w:t>
       </w:r>
       <w:r>
         <w:rPr>
           <w:i/>
           <w:iCs/>
         </w:rPr>
-        <w:t>Innovative research and practices in second language acquisition and bilingualism</w:t>
-      </w:r>
-      <w:r>
-        <w:t>, </w:t>
+        <w:t>38</w:t>
+      </w:r>
+      <w:r>
+        <w:t>, 193-220.</w:t>
+      </w:r>
+    </w:p>
+    <w:p>
+      <w:r>
+        <w:t>Gertken, L. M., Amengual, M., &amp; Birdsong, D. (2014). 11. assessing language dominance with the bilingual language profile. </w:t>
       </w:r>
       <w:r>
         <w:rPr>
           <w:i/>
           <w:iCs/>
         </w:rPr>
-        <w:t>38</w:t>
-      </w:r>
-      <w:r>
-        <w:t>, 193-220.</w:t>
+        <w:t>Measuring L2 proficiency: Perspectives from SLA</w:t>
+      </w:r>
+      <w:r>
+        <w:t>, 208-225.</w:t>
       </w:r>
     </w:p>
     <w:p>
@@ -1876,14 +1993,15 @@
     </w:p>
     <w:p>
       <w:r>
-        <w:t>Montrul, S. (2004). Subject and object expression in Spanish heritage speakers: A case of morphosyntactic convergence. </w:t>
+        <w:lastRenderedPageBreak/>
+        <w:t>Jacewicz, E., Fox, R. A., &amp; Salmons, J. (2011). Vowel change across three age groups of speakers in three regional varieties of American English. </w:t>
       </w:r>
       <w:r>
         <w:rPr>
           <w:i/>
           <w:iCs/>
         </w:rPr>
-        <w:t>Bilingualism: Language and cognition</w:t>
+        <w:t>Journal of phonetics</w:t>
       </w:r>
       <w:r>
         <w:t>, </w:t>
@@ -1893,22 +2011,22 @@
           <w:i/>
           <w:iCs/>
         </w:rPr>
-        <w:t>7</w:t>
-      </w:r>
-      <w:r>
-        <w:t>(2), 125-142.</w:t>
-      </w:r>
-    </w:p>
-    <w:p>
-      <w:r>
-        <w:t>Montrul, S. (2010). How similar are adult second language learners and Spanish heritage speakers? Spanish clitics and word order. </w:t>
+        <w:t>39</w:t>
+      </w:r>
+      <w:r>
+        <w:t>(4), 683-693.</w:t>
+      </w:r>
+    </w:p>
+    <w:p>
+      <w:r>
+        <w:t>Kruschke, J. K. (2018). Rejecting or accepting parameter values in Bayesian estimation. </w:t>
       </w:r>
       <w:r>
         <w:rPr>
           <w:i/>
           <w:iCs/>
         </w:rPr>
-        <w:t>Applied psycholinguistics</w:t>
+        <w:t>Advances in methods and practices in psychological science</w:t>
       </w:r>
       <w:r>
         <w:t>, </w:t>
@@ -1918,33 +2036,22 @@
           <w:i/>
           <w:iCs/>
         </w:rPr>
-        <w:t>31</w:t>
-      </w:r>
-      <w:r>
-        <w:t>(1), 167-207.</w:t>
-      </w:r>
-    </w:p>
-    <w:p>
-      <w:r>
-        <w:t>Rennicke, I. E. (2015). Variation and change in the rhotics of Brazilian Portuguese.</w:t>
-      </w:r>
-    </w:p>
-    <w:p>
-      <w:r>
-        <w:rPr>
-          <w:lang w:val="fr-FR"/>
-        </w:rPr>
-        <w:t xml:space="preserve">Wagner, P., Trouvain, J., &amp; Zimmerer, F. (2015). </w:t>
-      </w:r>
-      <w:r>
-        <w:t>In defense of stylistic diversity in speech research. </w:t>
+        <w:t>1</w:t>
+      </w:r>
+      <w:r>
+        <w:t>(2), 270-280.</w:t>
+      </w:r>
+    </w:p>
+    <w:p>
+      <w:r>
+        <w:t>Montrul, S. (2004). Subject and object expression in Spanish heritage speakers: A case of morphosyntactic convergence. </w:t>
       </w:r>
       <w:r>
         <w:rPr>
           <w:i/>
           <w:iCs/>
         </w:rPr>
-        <w:t>Journal of Phonetics</w:t>
+        <w:t>Bilingualism: Language and cognition</w:t>
       </w:r>
       <w:r>
         <w:t>, </w:t>
@@ -1954,22 +2061,22 @@
           <w:i/>
           <w:iCs/>
         </w:rPr>
-        <w:t>48</w:t>
-      </w:r>
-      <w:r>
-        <w:t>, 1-12.</w:t>
-      </w:r>
-    </w:p>
-    <w:p>
-      <w:r>
-        <w:t>Kruschke, J. K. (2018). Rejecting or accepting parameter values in Bayesian estimation. </w:t>
+        <w:t>7</w:t>
+      </w:r>
+      <w:r>
+        <w:t>(2), 125-142.</w:t>
+      </w:r>
+    </w:p>
+    <w:p>
+      <w:r>
+        <w:t>Montrul, S. (2010). How similar are adult second language learners and Spanish heritage speakers? Spanish clitics and word order. </w:t>
       </w:r>
       <w:r>
         <w:rPr>
           <w:i/>
           <w:iCs/>
         </w:rPr>
-        <w:t>Advances in methods and practices in psychological science</w:t>
+        <w:t>Applied psycholinguistics</w:t>
       </w:r>
       <w:r>
         <w:t>, </w:t>
@@ -1979,10 +2086,71 @@
           <w:i/>
           <w:iCs/>
         </w:rPr>
-        <w:t>1</w:t>
-      </w:r>
-      <w:r>
-        <w:t>(2), 270-280.</w:t>
+        <w:t>31</w:t>
+      </w:r>
+      <w:r>
+        <w:t>(1), 167-207.</w:t>
+      </w:r>
+    </w:p>
+    <w:p>
+      <w:r>
+        <w:t>Rennicke, I. E. (2015). Variation and change in the rhotics of Brazilian Portuguese.</w:t>
+      </w:r>
+    </w:p>
+    <w:p>
+      <w:r>
+        <w:rPr>
+          <w:lang w:val="fr-FR"/>
+        </w:rPr>
+        <w:t xml:space="preserve">Wagner, P., Trouvain, J., &amp; Zimmerer, F. (2015). </w:t>
+      </w:r>
+      <w:r>
+        <w:t>In defense of stylistic diversity in speech research. </w:t>
+      </w:r>
+      <w:r>
+        <w:rPr>
+          <w:i/>
+          <w:iCs/>
+        </w:rPr>
+        <w:t>Journal of Phonetics</w:t>
+      </w:r>
+      <w:r>
+        <w:t>, </w:t>
+      </w:r>
+      <w:r>
+        <w:rPr>
+          <w:i/>
+          <w:iCs/>
+        </w:rPr>
+        <w:t>48</w:t>
+      </w:r>
+      <w:r>
+        <w:t>, 1-12.</w:t>
+      </w:r>
+    </w:p>
+    <w:p>
+      <w:r>
+        <w:t>Zhou, C., &amp; Li, X. (2022). LextPT: A reliable and efficient vocabulary size test for L2 Portuguese proficiency. </w:t>
+      </w:r>
+      <w:r>
+        <w:rPr>
+          <w:i/>
+          <w:iCs/>
+        </w:rPr>
+        <w:t>Behavior Research Methods</w:t>
+      </w:r>
+      <w:r>
+        <w:t>, </w:t>
+      </w:r>
+      <w:r>
+        <w:rPr>
+          <w:i/>
+          <w:iCs/>
+        </w:rPr>
+        <w:t>54</w:t>
+      </w:r>
+      <w:r>
+        <w:t>(6), 2625-2639.</w:t>
       </w:r>
     </w:p>
     <w:sectPr>
@@ -1996,7 +2164,7 @@
 </file>
 
 <file path=word/comments.xml><?xml version="1.0" encoding="utf-8"?>
-<w:comments xmlns:wpc="http://schemas.microsoft.com/office/word/2010/wordprocessingCanvas" xmlns:cx="http://schemas.microsoft.com/office/drawing/2014/chartex" xmlns:cx1="http://schemas.microsoft.com/office/drawing/2015/9/8/chartex" xmlns:cx2="http://schemas.microsoft.com/office/drawing/2015/10/21/chartex" xmlns:cx3="http://schemas.microsoft.com/office/drawing/2016/5/9/chartex" xmlns:cx4="http://schemas.microsoft.com/office/drawing/2016/5/10/chartex" xmlns:cx5="http://schemas.microsoft.com/office/drawing/2016/5/11/chartex" xmlns:cx6="http://schemas.microsoft.com/office/drawing/2016/5/12/chartex" xmlns:cx7="http://schemas.microsoft.com/office/drawing/2016/5/13/chartex" xmlns:cx8="http://schemas.microsoft.com/office/drawing/2016/5/14/chartex" xmlns:mc="http://schemas.openxmlformats.org/markup-compatibility/2006" xmlns:aink="http://schemas.microsoft.com/office/drawing/2016/ink" xmlns:am3d="http://schemas.microsoft.com/office/drawing/2017/model3d" xmlns:o="urn:schemas-microsoft-com:office:office" xmlns:oel="http://schemas.microsoft.com/office/2019/extlst" xmlns:r="http://schemas.openxmlformats.org/officeDocument/2006/relationships" xmlns:m="http://schemas.openxmlformats.org/officeDocument/2006/math" xmlns:v="urn:schemas-microsoft-com:vml" xmlns:wp14="http://schemas.microsoft.com/office/word/2010/wordprocessingDrawing" xmlns:wp="http://schemas.openxmlformats.org/drawingml/2006/wordprocessingDrawing" xmlns:w10="urn:schemas-microsoft-com:office:word" xmlns:w="http://schemas.openxmlformats.org/wordprocessingml/2006/main" xmlns:w14="http://schemas.microsoft.com/office/word/2010/wordml" xmlns:w15="http://schemas.microsoft.com/office/word/2012/wordml" xmlns:w16cex="http://schemas.microsoft.com/office/word/2018/wordml/cex" xmlns:w16cid="http://schemas.microsoft.com/office/word/2016/wordml/cid" xmlns:w16="http://schemas.microsoft.com/office/word/2018/wordml" xmlns:w16du="http://schemas.microsoft.com/office/word/2023/wordml/word16du" xmlns:w16sdtdh="http://schemas.microsoft.com/office/word/2020/wordml/sdtdatahash" xmlns:w16sdtfl="http://schemas.microsoft.com/office/word/2024/wordml/sdtformatlock" xmlns:w16se="http://schemas.microsoft.com/office/word/2015/wordml/symex" xmlns:wpg="http://schemas.microsoft.com/office/word/2010/wordprocessingGroup" xmlns:wpi="http://schemas.microsoft.com/office/word/2010/wordprocessingInk" xmlns:wne="http://schemas.microsoft.com/office/word/2006/wordml" xmlns:wps="http://schemas.microsoft.com/office/word/2010/wordprocessingShape" mc:Ignorable="w14 w15 w16se w16cid w16 w16cex w16sdtdh w16sdtfl w16du wp14">
+<w:comments xmlns:wpc="http://schemas.microsoft.com/office/word/2010/wordprocessingCanvas" xmlns:cx="http://schemas.microsoft.com/office/drawing/2014/chartex" xmlns:cx1="http://schemas.microsoft.com/office/drawing/2015/9/8/chartex" xmlns:cx2="http://schemas.microsoft.com/office/drawing/2015/10/21/chartex" xmlns:cx3="http://schemas.microsoft.com/office/drawing/2016/5/9/chartex" xmlns:cx4="http://schemas.microsoft.com/office/drawing/2016/5/10/chartex" xmlns:cx5="http://schemas.microsoft.com/office/drawing/2016/5/11/chartex" xmlns:cx6="http://schemas.microsoft.com/office/drawing/2016/5/12/chartex" xmlns:cx7="http://schemas.microsoft.com/office/drawing/2016/5/13/chartex" xmlns:cx8="http://schemas.microsoft.com/office/drawing/2016/5/14/chartex" xmlns:mc="http://schemas.openxmlformats.org/markup-compatibility/2006" xmlns:aink="http://schemas.microsoft.com/office/drawing/2016/ink" xmlns:am3d="http://schemas.microsoft.com/office/drawing/2017/model3d" xmlns:o="urn:schemas-microsoft-com:office:office" xmlns:oel="http://schemas.microsoft.com/office/2019/extlst" xmlns:r="http://schemas.openxmlformats.org/officeDocument/2006/relationships" xmlns:m="http://schemas.openxmlformats.org/officeDocument/2006/math" xmlns:v="urn:schemas-microsoft-com:vml" xmlns:wp14="http://schemas.microsoft.com/office/word/2010/wordprocessingDrawing" xmlns:wp="http://schemas.openxmlformats.org/drawingml/2006/wordprocessingDrawing" xmlns:w10="urn:schemas-microsoft-com:office:word" xmlns:w="http://schemas.openxmlformats.org/wordprocessingml/2006/main" xmlns:w14="http://schemas.microsoft.com/office/word/2010/wordml" xmlns:w15="http://schemas.microsoft.com/office/word/2012/wordml" xmlns:w16cei="http://schemas.microsoft.com/office/word/2026/wordml/cei" xmlns:w16cex="http://schemas.microsoft.com/office/word/2018/wordml/cex" xmlns:w16cid="http://schemas.microsoft.com/office/word/2016/wordml/cid" xmlns:w16="http://schemas.microsoft.com/office/word/2018/wordml" xmlns:w16du="http://schemas.microsoft.com/office/word/2023/wordml/word16du" xmlns:w16sdtdh="http://schemas.microsoft.com/office/word/2020/wordml/sdtdatahash" xmlns:w16sdtfl="http://schemas.microsoft.com/office/word/2024/wordml/sdtformatlock" xmlns:w16se="http://schemas.microsoft.com/office/word/2015/wordml/symex" xmlns:wpg="http://schemas.microsoft.com/office/word/2010/wordprocessingGroup" xmlns:wpi="http://schemas.microsoft.com/office/word/2010/wordprocessingInk" xmlns:wne="http://schemas.microsoft.com/office/word/2006/wordml" xmlns:wps="http://schemas.microsoft.com/office/word/2010/wordprocessingShape" mc:Ignorable="w14 w15 w16se w16cid w16 w16cex w16sdtdh w16sdtfl w16du wp14">
   <w:comment w:id="0" w:author="Kendra Dickinson" w:date="2026-06-25T07:13:00Z" w:initials="KD">
     <w:p>
       <w:r>
@@ -2126,17 +2294,17 @@
 </file>
 
 <file path=word/commentsExtended.xml><?xml version="1.0" encoding="utf-8"?>
-<w15:commentsEx xmlns:wpc="http://schemas.microsoft.com/office/word/2010/wordprocessingCanvas" xmlns:cx="http://schemas.microsoft.com/office/drawing/2014/chartex" xmlns:cx1="http://schemas.microsoft.com/office/drawing/2015/9/8/chartex" xmlns:cx2="http://schemas.microsoft.com/office/drawing/2015/10/21/chartex" xmlns:cx3="http://schemas.microsoft.com/office/drawing/2016/5/9/chartex" xmlns:cx4="http://schemas.microsoft.com/office/drawing/2016/5/10/chartex" xmlns:cx5="http://schemas.microsoft.com/office/drawing/2016/5/11/chartex" xmlns:cx6="http://schemas.microsoft.com/office/drawing/2016/5/12/chartex" xmlns:cx7="http://schemas.microsoft.com/office/drawing/2016/5/13/chartex" xmlns:cx8="http://schemas.microsoft.com/office/drawing/2016/5/14/chartex" xmlns:mc="http://schemas.openxmlformats.org/markup-compatibility/2006" xmlns:aink="http://schemas.microsoft.com/office/drawing/2016/ink" xmlns:am3d="http://schemas.microsoft.com/office/drawing/2017/model3d" xmlns:o="urn:schemas-microsoft-com:office:office" xmlns:oel="http://schemas.microsoft.com/office/2019/extlst" xmlns:r="http://schemas.openxmlformats.org/officeDocument/2006/relationships" xmlns:m="http://schemas.openxmlformats.org/officeDocument/2006/math" xmlns:v="urn:schemas-microsoft-com:vml" xmlns:wp14="http://schemas.microsoft.com/office/word/2010/wordprocessingDrawing" xmlns:wp="http://schemas.openxmlformats.org/drawingml/2006/wordprocessingDrawing" xmlns:w10="urn:schemas-microsoft-com:office:word" xmlns:w="http://schemas.openxmlformats.org/wordprocessingml/2006/main" xmlns:w14="http://schemas.microsoft.com/office/word/2010/wordml" xmlns:w15="http://schemas.microsoft.com/office/word/2012/wordml" xmlns:w16cex="http://schemas.microsoft.com/office/word/2018/wordml/cex" xmlns:w16cid="http://schemas.microsoft.com/office/word/2016/wordml/cid" xmlns:w16="http://schemas.microsoft.com/office/word/2018/wordml" xmlns:w16du="http://schemas.microsoft.com/office/word/2023/wordml/word16du" xmlns:w16sdtdh="http://schemas.microsoft.com/office/word/2020/wordml/sdtdatahash" xmlns:w16sdtfl="http://schemas.microsoft.com/office/word/2024/wordml/sdtformatlock" xmlns:w16se="http://schemas.microsoft.com/office/word/2015/wordml/symex" xmlns:wpg="http://schemas.microsoft.com/office/word/2010/wordprocessingGroup" xmlns:wpi="http://schemas.microsoft.com/office/word/2010/wordprocessingInk" xmlns:wne="http://schemas.microsoft.com/office/word/2006/wordml" xmlns:wps="http://schemas.microsoft.com/office/word/2010/wordprocessingShape" mc:Ignorable="w14 w15 w16se w16cid w16 w16cex w16sdtdh w16sdtfl w16du wp14">
-  <w15:commentEx w15:paraId="2DA807FB" w15:done="0"/>
-  <w15:commentEx w15:paraId="1CA08483" w15:done="0"/>
-  <w15:commentEx w15:paraId="38A24E1D" w15:done="0"/>
-  <w15:commentEx w15:paraId="31AA1A71" w15:done="0"/>
-  <w15:commentEx w15:paraId="4707B85A" w15:done="0"/>
+<w15:commentsEx xmlns:wpc="http://schemas.microsoft.com/office/word/2010/wordprocessingCanvas" xmlns:cx="http://schemas.microsoft.com/office/drawing/2014/chartex" xmlns:cx1="http://schemas.microsoft.com/office/drawing/2015/9/8/chartex" xmlns:cx2="http://schemas.microsoft.com/office/drawing/2015/10/21/chartex" xmlns:cx3="http://schemas.microsoft.com/office/drawing/2016/5/9/chartex" xmlns:cx4="http://schemas.microsoft.com/office/drawing/2016/5/10/chartex" xmlns:cx5="http://schemas.microsoft.com/office/drawing/2016/5/11/chartex" xmlns:cx6="http://schemas.microsoft.com/office/drawing/2016/5/12/chartex" xmlns:cx7="http://schemas.microsoft.com/office/drawing/2016/5/13/chartex" xmlns:cx8="http://schemas.microsoft.com/office/drawing/2016/5/14/chartex" xmlns:mc="http://schemas.openxmlformats.org/markup-compatibility/2006" xmlns:aink="http://schemas.microsoft.com/office/drawing/2016/ink" xmlns:am3d="http://schemas.microsoft.com/office/drawing/2017/model3d" xmlns:o="urn:schemas-microsoft-com:office:office" xmlns:oel="http://schemas.microsoft.com/office/2019/extlst" xmlns:r="http://schemas.openxmlformats.org/officeDocument/2006/relationships" xmlns:m="http://schemas.openxmlformats.org/officeDocument/2006/math" xmlns:v="urn:schemas-microsoft-com:vml" xmlns:wp14="http://schemas.microsoft.com/office/word/2010/wordprocessingDrawing" xmlns:wp="http://schemas.openxmlformats.org/drawingml/2006/wordprocessingDrawing" xmlns:w10="urn:schemas-microsoft-com:office:word" xmlns:w="http://schemas.openxmlformats.org/wordprocessingml/2006/main" xmlns:w14="http://schemas.microsoft.com/office/word/2010/wordml" xmlns:w15="http://schemas.microsoft.com/office/word/2012/wordml" xmlns:w16cei="http://schemas.microsoft.com/office/word/2026/wordml/cei" xmlns:w16cex="http://schemas.microsoft.com/office/word/2018/wordml/cex" xmlns:w16cid="http://schemas.microsoft.com/office/word/2016/wordml/cid" xmlns:w16="http://schemas.microsoft.com/office/word/2018/wordml" xmlns:w16du="http://schemas.microsoft.com/office/word/2023/wordml/word16du" xmlns:w16sdtdh="http://schemas.microsoft.com/office/word/2020/wordml/sdtdatahash" xmlns:w16sdtfl="http://schemas.microsoft.com/office/word/2024/wordml/sdtformatlock" xmlns:w16se="http://schemas.microsoft.com/office/word/2015/wordml/symex" xmlns:wpg="http://schemas.microsoft.com/office/word/2010/wordprocessingGroup" xmlns:wpi="http://schemas.microsoft.com/office/word/2010/wordprocessingInk" xmlns:wne="http://schemas.microsoft.com/office/word/2006/wordml" xmlns:wps="http://schemas.microsoft.com/office/word/2010/wordprocessingShape" mc:Ignorable="w14 w15 w16se w16cid w16 w16cex w16sdtdh w16sdtfl w16du wp14">
+  <w15:commentEx w15:paraId="2DA807FB" w15:done="1"/>
+  <w15:commentEx w15:paraId="1CA08483" w15:done="1"/>
+  <w15:commentEx w15:paraId="38A24E1D" w15:done="1"/>
+  <w15:commentEx w15:paraId="31AA1A71" w15:done="1"/>
+  <w15:commentEx w15:paraId="4707B85A" w15:done="1"/>
 </w15:commentsEx>
 </file>
 
 <file path=word/commentsExtensible.xml><?xml version="1.0" encoding="utf-8"?>
-<w16cex:commentsExtensible xmlns:wpc="http://schemas.microsoft.com/office/word/2010/wordprocessingCanvas" xmlns:cx="http://schemas.microsoft.com/office/drawing/2014/chartex" xmlns:cx1="http://schemas.microsoft.com/office/drawing/2015/9/8/chartex" xmlns:cx2="http://schemas.microsoft.com/office/drawing/2015/10/21/chartex" xmlns:cx3="http://schemas.microsoft.com/office/drawing/2016/5/9/chartex" xmlns:cx4="http://schemas.microsoft.com/office/drawing/2016/5/10/chartex" xmlns:cx5="http://schemas.microsoft.com/office/drawing/2016/5/11/chartex" xmlns:cx6="http://schemas.microsoft.com/office/drawing/2016/5/12/chartex" xmlns:cx7="http://schemas.microsoft.com/office/drawing/2016/5/13/chartex" xmlns:cx8="http://schemas.microsoft.com/office/drawing/2016/5/14/chartex" xmlns:cr="http://schemas.microsoft.com/office/comments/2020/reactions" xmlns:mc="http://schemas.openxmlformats.org/markup-compatibility/2006" xmlns:aink="http://schemas.microsoft.com/office/drawing/2016/ink" xmlns:am3d="http://schemas.microsoft.com/office/drawing/2017/model3d" xmlns:o="urn:schemas-microsoft-com:office:office" xmlns:oel="http://schemas.microsoft.com/office/2019/extlst" xmlns:r="http://schemas.openxmlformats.org/officeDocument/2006/relationships" xmlns:m="http://schemas.openxmlformats.org/officeDocument/2006/math" xmlns:v="urn:schemas-microsoft-com:vml" xmlns:wp14="http://schemas.microsoft.com/office/word/2010/wordprocessingDrawing" xmlns:wp="http://schemas.openxmlformats.org/drawingml/2006/wordprocessingDrawing" xmlns:w10="urn:schemas-microsoft-com:office:word" xmlns:w="http://schemas.openxmlformats.org/wordprocessingml/2006/main" xmlns:w14="http://schemas.microsoft.com/office/word/2010/wordml" xmlns:w15="http://schemas.microsoft.com/office/word/2012/wordml" xmlns:w16cex="http://schemas.microsoft.com/office/word/2018/wordml/cex" xmlns:w16cid="http://schemas.microsoft.com/office/word/2016/wordml/cid" xmlns:w16="http://schemas.microsoft.com/office/word/2018/wordml" xmlns:w16du="http://schemas.microsoft.com/office/word/2023/wordml/word16du" xmlns:w16sdtdh="http://schemas.microsoft.com/office/word/2020/wordml/sdtdatahash" xmlns:w16sdtfl="http://schemas.microsoft.com/office/word/2024/wordml/sdtformatlock" xmlns:w16se="http://schemas.microsoft.com/office/word/2015/wordml/symex" xmlns:wpg="http://schemas.microsoft.com/office/word/2010/wordprocessingGroup" xmlns:wpi="http://schemas.microsoft.com/office/word/2010/wordprocessingInk" xmlns:wne="http://schemas.microsoft.com/office/word/2006/wordml" xmlns:wps="http://schemas.microsoft.com/office/word/2010/wordprocessingShape" mc:Ignorable="w14 w15 w16se w16cid w16 w16cex w16sdtdh w16sdtfl cr w16du wp14">
+<w16cex:commentsExtensible xmlns:wpc="http://schemas.microsoft.com/office/word/2010/wordprocessingCanvas" xmlns:cx="http://schemas.microsoft.com/office/drawing/2014/chartex" xmlns:cx1="http://schemas.microsoft.com/office/drawing/2015/9/8/chartex" xmlns:cx2="http://schemas.microsoft.com/office/drawing/2015/10/21/chartex" xmlns:cx3="http://schemas.microsoft.com/office/drawing/2016/5/9/chartex" xmlns:cx4="http://schemas.microsoft.com/office/drawing/2016/5/10/chartex" xmlns:cx5="http://schemas.microsoft.com/office/drawing/2016/5/11/chartex" xmlns:cx6="http://schemas.microsoft.com/office/drawing/2016/5/12/chartex" xmlns:cx7="http://schemas.microsoft.com/office/drawing/2016/5/13/chartex" xmlns:cx8="http://schemas.microsoft.com/office/drawing/2016/5/14/chartex" xmlns:cr="http://schemas.microsoft.com/office/comments/2020/reactions" xmlns:mc="http://schemas.openxmlformats.org/markup-compatibility/2006" xmlns:aink="http://schemas.microsoft.com/office/drawing/2016/ink" xmlns:am3d="http://schemas.microsoft.com/office/drawing/2017/model3d" xmlns:o="urn:schemas-microsoft-com:office:office" xmlns:oel="http://schemas.microsoft.com/office/2019/extlst" xmlns:r="http://schemas.openxmlformats.org/officeDocument/2006/relationships" xmlns:m="http://schemas.openxmlformats.org/officeDocument/2006/math" xmlns:v="urn:schemas-microsoft-com:vml" xmlns:wp14="http://schemas.microsoft.com/office/word/2010/wordprocessingDrawing" xmlns:wp="http://schemas.openxmlformats.org/drawingml/2006/wordprocessingDrawing" xmlns:w10="urn:schemas-microsoft-com:office:word" xmlns:w="http://schemas.openxmlformats.org/wordprocessingml/2006/main" xmlns:w14="http://schemas.microsoft.com/office/word/2010/wordml" xmlns:w15="http://schemas.microsoft.com/office/word/2012/wordml" xmlns:w16cei="http://schemas.microsoft.com/office/word/2026/wordml/cei" xmlns:w16cex="http://schemas.microsoft.com/office/word/2018/wordml/cex" xmlns:w16cid="http://schemas.microsoft.com/office/word/2016/wordml/cid" xmlns:w16="http://schemas.microsoft.com/office/word/2018/wordml" xmlns:w16du="http://schemas.microsoft.com/office/word/2023/wordml/word16du" xmlns:w16sdtdh="http://schemas.microsoft.com/office/word/2020/wordml/sdtdatahash" xmlns:w16sdtfl="http://schemas.microsoft.com/office/word/2024/wordml/sdtformatlock" xmlns:w16se="http://schemas.microsoft.com/office/word/2015/wordml/symex" xmlns:wpg="http://schemas.microsoft.com/office/word/2010/wordprocessingGroup" xmlns:wpi="http://schemas.microsoft.com/office/word/2010/wordprocessingInk" xmlns:wne="http://schemas.microsoft.com/office/word/2006/wordml" xmlns:wps="http://schemas.microsoft.com/office/word/2010/wordprocessingShape" mc:Ignorable="w14 w15 w16se w16cid w16 w16cex w16sdtdh w16sdtfl cr w16du wp14">
   <w16cex:commentExtensible w16cex:durableId="1434D524" w16cex:dateUtc="2026-06-25T11:13:00Z"/>
   <w16cex:commentExtensible w16cex:durableId="74F17809" w16cex:dateUtc="2026-07-06T13:33:00Z"/>
   <w16cex:commentExtensible w16cex:durableId="6554F1C6" w16cex:dateUtc="2026-06-25T11:05:00Z"/>
@@ -2146,7 +2314,7 @@
 </file>
 
 <file path=word/commentsIds.xml><?xml version="1.0" encoding="utf-8"?>
-<w16cid:commentsIds xmlns:wpc="http://schemas.microsoft.com/office/word/2010/wordprocessingCanvas" xmlns:cx="http://schemas.microsoft.com/office/drawing/2014/chartex" xmlns:cx1="http://schemas.microsoft.com/office/drawing/2015/9/8/chartex" xmlns:cx2="http://schemas.microsoft.com/office/drawing/2015/10/21/chartex" xmlns:cx3="http://schemas.microsoft.com/office/drawing/2016/5/9/chartex" xmlns:cx4="http://schemas.microsoft.com/office/drawing/2016/5/10/chartex" xmlns:cx5="http://schemas.microsoft.com/office/drawing/2016/5/11/chartex" xmlns:cx6="http://schemas.microsoft.com/office/drawing/2016/5/12/chartex" xmlns:cx7="http://schemas.microsoft.com/office/drawing/2016/5/13/chartex" xmlns:cx8="http://schemas.microsoft.com/office/drawing/2016/5/14/chartex" xmlns:mc="http://schemas.openxmlformats.org/markup-compatibility/2006" xmlns:aink="http://schemas.microsoft.com/office/drawing/2016/ink" xmlns:am3d="http://schemas.microsoft.com/office/drawing/2017/model3d" xmlns:o="urn:schemas-microsoft-com:office:office" xmlns:oel="http://schemas.microsoft.com/office/2019/extlst" xmlns:r="http://schemas.openxmlformats.org/officeDocument/2006/relationships" xmlns:m="http://schemas.openxmlformats.org/officeDocument/2006/math" xmlns:v="urn:schemas-microsoft-com:vml" xmlns:wp14="http://schemas.microsoft.com/office/word/2010/wordprocessingDrawing" xmlns:wp="http://schemas.openxmlformats.org/drawingml/2006/wordprocessingDrawing" xmlns:w10="urn:schemas-microsoft-com:office:word" xmlns:w="http://schemas.openxmlformats.org/wordprocessingml/2006/main" xmlns:w14="http://schemas.microsoft.com/office/word/2010/wordml" xmlns:w15="http://schemas.microsoft.com/office/word/2012/wordml" xmlns:w16cex="http://schemas.microsoft.com/office/word/2018/wordml/cex" xmlns:w16cid="http://schemas.microsoft.com/office/word/2016/wordml/cid" xmlns:w16="http://schemas.microsoft.com/office/word/2018/wordml" xmlns:w16du="http://schemas.microsoft.com/office/word/2023/wordml/word16du" xmlns:w16sdtdh="http://schemas.microsoft.com/office/word/2020/wordml/sdtdatahash" xmlns:w16sdtfl="http://schemas.microsoft.com/office/word/2024/wordml/sdtformatlock" xmlns:w16se="http://schemas.microsoft.com/office/word/2015/wordml/symex" xmlns:wpg="http://schemas.microsoft.com/office/word/2010/wordprocessingGroup" xmlns:wpi="http://schemas.microsoft.com/office/word/2010/wordprocessingInk" xmlns:wne="http://schemas.microsoft.com/office/word/2006/wordml" xmlns:wps="http://schemas.microsoft.com/office/word/2010/wordprocessingShape" mc:Ignorable="w14 w15 w16se w16cid w16 w16cex w16sdtdh w16sdtfl w16du wp14">
+<w16cid:commentsIds xmlns:wpc="http://schemas.microsoft.com/office/word/2010/wordprocessingCanvas" xmlns:cx="http://schemas.microsoft.com/office/drawing/2014/chartex" xmlns:cx1="http://schemas.microsoft.com/office/drawing/2015/9/8/chartex" xmlns:cx2="http://schemas.microsoft.com/office/drawing/2015/10/21/chartex" xmlns:cx3="http://schemas.microsoft.com/office/drawing/2016/5/9/chartex" xmlns:cx4="http://schemas.microsoft.com/office/drawing/2016/5/10/chartex" xmlns:cx5="http://schemas.microsoft.com/office/drawing/2016/5/11/chartex" xmlns:cx6="http://schemas.microsoft.com/office/drawing/2016/5/12/chartex" xmlns:cx7="http://schemas.microsoft.com/office/drawing/2016/5/13/chartex" xmlns:cx8="http://schemas.microsoft.com/office/drawing/2016/5/14/chartex" xmlns:mc="http://schemas.openxmlformats.org/markup-compatibility/2006" xmlns:aink="http://schemas.microsoft.com/office/drawing/2016/ink" xmlns:am3d="http://schemas.microsoft.com/office/drawing/2017/model3d" xmlns:o="urn:schemas-microsoft-com:office:office" xmlns:oel="http://schemas.microsoft.com/office/2019/extlst" xmlns:r="http://schemas.openxmlformats.org/officeDocument/2006/relationships" xmlns:m="http://schemas.openxmlformats.org/officeDocument/2006/math" xmlns:v="urn:schemas-microsoft-com:vml" xmlns:wp14="http://schemas.microsoft.com/office/word/2010/wordprocessingDrawing" xmlns:wp="http://schemas.openxmlformats.org/drawingml/2006/wordprocessingDrawing" xmlns:w10="urn:schemas-microsoft-com:office:word" xmlns:w="http://schemas.openxmlformats.org/wordprocessingml/2006/main" xmlns:w14="http://schemas.microsoft.com/office/word/2010/wordml" xmlns:w15="http://schemas.microsoft.com/office/word/2012/wordml" xmlns:w16cei="http://schemas.microsoft.com/office/word/2026/wordml/cei" xmlns:w16cex="http://schemas.microsoft.com/office/word/2018/wordml/cex" xmlns:w16cid="http://schemas.microsoft.com/office/word/2016/wordml/cid" xmlns:w16="http://schemas.microsoft.com/office/word/2018/wordml" xmlns:w16du="http://schemas.microsoft.com/office/word/2023/wordml/word16du" xmlns:w16sdtdh="http://schemas.microsoft.com/office/word/2020/wordml/sdtdatahash" xmlns:w16sdtfl="http://schemas.microsoft.com/office/word/2024/wordml/sdtformatlock" xmlns:w16se="http://schemas.microsoft.com/office/word/2015/wordml/symex" xmlns:wpg="http://schemas.microsoft.com/office/word/2010/wordprocessingGroup" xmlns:wpi="http://schemas.microsoft.com/office/word/2010/wordprocessingInk" xmlns:wne="http://schemas.microsoft.com/office/word/2006/wordml" xmlns:wps="http://schemas.microsoft.com/office/word/2010/wordprocessingShape" mc:Ignorable="w14 w15 w16se w16cid w16 w16cex w16sdtdh w16sdtfl w16du wp14">
   <w16cid:commentId w16cid:paraId="2DA807FB" w16cid:durableId="1434D524"/>
   <w16cid:commentId w16cid:paraId="1CA08483" w16cid:durableId="74F17809"/>
   <w16cid:commentId w16cid:paraId="38A24E1D" w16cid:durableId="6554F1C6"/>
@@ -2156,7 +2324,7 @@
 </file>
 
 <file path=word/numbering.xml><?xml version="1.0" encoding="utf-8"?>
-<w:numbering xmlns:wpc="http://schemas.microsoft.com/office/word/2010/wordprocessingCanvas" xmlns:cx="http://schemas.microsoft.com/office/drawing/2014/chartex" xmlns:cx1="http://schemas.microsoft.com/office/drawing/2015/9/8/chartex" xmlns:cx2="http://schemas.microsoft.com/office/drawing/2015/10/21/chartex" xmlns:cx3="http://schemas.microsoft.com/office/drawing/2016/5/9/chartex" xmlns:cx4="http://schemas.microsoft.com/office/drawing/2016/5/10/chartex" xmlns:cx5="http://schemas.microsoft.com/office/drawing/2016/5/11/chartex" xmlns:cx6="http://schemas.microsoft.com/office/drawing/2016/5/12/chartex" xmlns:cx7="http://schemas.microsoft.com/office/drawing/2016/5/13/chartex" xmlns:cx8="http://schemas.microsoft.com/office/drawing/2016/5/14/chartex" xmlns:mc="http://schemas.openxmlformats.org/markup-compatibility/2006" xmlns:aink="http://schemas.microsoft.com/office/drawing/2016/ink" xmlns:am3d="http://schemas.microsoft.com/office/drawing/2017/model3d" xmlns:o="urn:schemas-microsoft-com:office:office" xmlns:oel="http://schemas.microsoft.com/office/2019/extlst" xmlns:r="http://schemas.openxmlformats.org/officeDocument/2006/relationships" xmlns:m="http://schemas.openxmlformats.org/officeDocument/2006/math" xmlns:v="urn:schemas-microsoft-com:vml" xmlns:wp14="http://schemas.microsoft.com/office/word/2010/wordprocessingDrawing" xmlns:wp="http://schemas.openxmlformats.org/drawingml/2006/wordprocessingDrawing" xmlns:w10="urn:schemas-microsoft-com:office:word" xmlns:w="http://schemas.openxmlformats.org/wordprocessingml/2006/main" xmlns:w14="http://schemas.microsoft.com/office/word/2010/wordml" xmlns:w15="http://schemas.microsoft.com/office/word/2012/wordml" xmlns:w16cex="http://schemas.microsoft.com/office/word/2018/wordml/cex" xmlns:w16cid="http://schemas.microsoft.com/office/word/2016/wordml/cid" xmlns:w16="http://schemas.microsoft.com/office/word/2018/wordml" xmlns:w16du="http://schemas.microsoft.com/office/word/2023/wordml/word16du" xmlns:w16sdtdh="http://schemas.microsoft.com/office/word/2020/wordml/sdtdatahash" xmlns:w16sdtfl="http://schemas.microsoft.com/office/word/2024/wordml/sdtformatlock" xmlns:w16se="http://schemas.microsoft.com/office/word/2015/wordml/symex" xmlns:wpg="http://schemas.microsoft.com/office/word/2010/wordprocessingGroup" xmlns:wpi="http://schemas.microsoft.com/office/word/2010/wordprocessingInk" xmlns:wne="http://schemas.microsoft.com/office/word/2006/wordml" xmlns:wps="http://schemas.microsoft.com/office/word/2010/wordprocessingShape" mc:Ignorable="w14 w15 w16se w16cid w16 w16cex w16sdtdh w16sdtfl w16du wp14">
+<w:numbering xmlns:wpc="http://schemas.microsoft.com/office/word/2010/wordprocessingCanvas" xmlns:cx="http://schemas.microsoft.com/office/drawing/2014/chartex" xmlns:cx1="http://schemas.microsoft.com/office/drawing/2015/9/8/chartex" xmlns:cx2="http://schemas.microsoft.com/office/drawing/2015/10/21/chartex" xmlns:cx3="http://schemas.microsoft.com/office/drawing/2016/5/9/chartex" xmlns:cx4="http://schemas.microsoft.com/office/drawing/2016/5/10/chartex" xmlns:cx5="http://schemas.microsoft.com/office/drawing/2016/5/11/chartex" xmlns:cx6="http://schemas.microsoft.com/office/drawing/2016/5/12/chartex" xmlns:cx7="http://schemas.microsoft.com/office/drawing/2016/5/13/chartex" xmlns:cx8="http://schemas.microsoft.com/office/drawing/2016/5/14/chartex" xmlns:mc="http://schemas.openxmlformats.org/markup-compatibility/2006" xmlns:aink="http://schemas.microsoft.com/office/drawing/2016/ink" xmlns:am3d="http://schemas.microsoft.com/office/drawing/2017/model3d" xmlns:o="urn:schemas-microsoft-com:office:office" xmlns:oel="http://schemas.microsoft.com/office/2019/extlst" xmlns:r="http://schemas.openxmlformats.org/officeDocument/2006/relationships" xmlns:m="http://schemas.openxmlformats.org/officeDocument/2006/math" xmlns:v="urn:schemas-microsoft-com:vml" xmlns:wp14="http://schemas.microsoft.com/office/word/2010/wordprocessingDrawing" xmlns:wp="http://schemas.openxmlformats.org/drawingml/2006/wordprocessingDrawing" xmlns:w10="urn:schemas-microsoft-com:office:word" xmlns:w="http://schemas.openxmlformats.org/wordprocessingml/2006/main" xmlns:w14="http://schemas.microsoft.com/office/word/2010/wordml" xmlns:w15="http://schemas.microsoft.com/office/word/2012/wordml" xmlns:w16cei="http://schemas.microsoft.com/office/word/2026/wordml/cei" xmlns:w16cex="http://schemas.microsoft.com/office/word/2018/wordml/cex" xmlns:w16cid="http://schemas.microsoft.com/office/word/2016/wordml/cid" xmlns:w16="http://schemas.microsoft.com/office/word/2018/wordml" xmlns:w16du="http://schemas.microsoft.com/office/word/2023/wordml/word16du" xmlns:w16sdtdh="http://schemas.microsoft.com/office/word/2020/wordml/sdtdatahash" xmlns:w16sdtfl="http://schemas.microsoft.com/office/word/2024/wordml/sdtformatlock" xmlns:w16se="http://schemas.microsoft.com/office/word/2015/wordml/symex" xmlns:wpg="http://schemas.microsoft.com/office/word/2010/wordprocessingGroup" xmlns:wpi="http://schemas.microsoft.com/office/word/2010/wordprocessingInk" xmlns:wne="http://schemas.microsoft.com/office/word/2006/wordml" xmlns:wps="http://schemas.microsoft.com/office/word/2010/wordprocessingShape" mc:Ignorable="w14 w15 w16se w16cid w16 w16cex w16sdtdh w16sdtfl w16du wp14">
   <w:abstractNum w:abstractNumId="0" w15:restartNumberingAfterBreak="0">
     <w:nsid w:val="10D73FD5"/>
     <w:multiLevelType w:val="hybridMultilevel"/>
@@ -2875,7 +3043,7 @@
 </file>
 
 <file path=word/people.xml><?xml version="1.0" encoding="utf-8"?>
-<w15:people xmlns:wpc="http://schemas.microsoft.com/office/word/2010/wordprocessingCanvas" xmlns:cx="http://schemas.microsoft.com/office/drawing/2014/chartex" xmlns:cx1="http://schemas.microsoft.com/office/drawing/2015/9/8/chartex" xmlns:cx2="http://schemas.microsoft.com/office/drawing/2015/10/21/chartex" xmlns:cx3="http://schemas.microsoft.com/office/drawing/2016/5/9/chartex" xmlns:cx4="http://schemas.microsoft.com/office/drawing/2016/5/10/chartex" xmlns:cx5="http://schemas.microsoft.com/office/drawing/2016/5/11/chartex" xmlns:cx6="http://schemas.microsoft.com/office/drawing/2016/5/12/chartex" xmlns:cx7="http://schemas.microsoft.com/office/drawing/2016/5/13/chartex" xmlns:cx8="http://schemas.microsoft.com/office/drawing/2016/5/14/chartex" xmlns:mc="http://schemas.openxmlformats.org/markup-compatibility/2006" xmlns:aink="http://schemas.microsoft.com/office/drawing/2016/ink" xmlns:am3d="http://schemas.microsoft.com/office/drawing/2017/model3d" xmlns:o="urn:schemas-microsoft-com:office:office" xmlns:oel="http://schemas.microsoft.com/office/2019/extlst" xmlns:r="http://schemas.openxmlformats.org/officeDocument/2006/relationships" xmlns:m="http://schemas.openxmlformats.org/officeDocument/2006/math" xmlns:v="urn:schemas-microsoft-com:vml" xmlns:wp14="http://schemas.microsoft.com/office/word/2010/wordprocessingDrawing" xmlns:wp="http://schemas.openxmlformats.org/drawingml/2006/wordprocessingDrawing" xmlns:w10="urn:schemas-microsoft-com:office:word" xmlns:w="http://schemas.openxmlformats.org/wordprocessingml/2006/main" xmlns:w14="http://schemas.microsoft.com/office/word/2010/wordml" xmlns:w15="http://schemas.microsoft.com/office/word/2012/wordml" xmlns:w16cex="http://schemas.microsoft.com/office/word/2018/wordml/cex" xmlns:w16cid="http://schemas.microsoft.com/office/word/2016/wordml/cid" xmlns:w16="http://schemas.microsoft.com/office/word/2018/wordml" xmlns:w16du="http://schemas.microsoft.com/office/word/2023/wordml/word16du" xmlns:w16sdtdh="http://schemas.microsoft.com/office/word/2020/wordml/sdtdatahash" xmlns:w16sdtfl="http://schemas.microsoft.com/office/word/2024/wordml/sdtformatlock" xmlns:w16se="http://schemas.microsoft.com/office/word/2015/wordml/symex" xmlns:wpg="http://schemas.microsoft.com/office/word/2010/wordprocessingGroup" xmlns:wpi="http://schemas.microsoft.com/office/word/2010/wordprocessingInk" xmlns:wne="http://schemas.microsoft.com/office/word/2006/wordml" xmlns:wps="http://schemas.microsoft.com/office/word/2010/wordprocessingShape" mc:Ignorable="w14 w15 w16se w16cid w16 w16cex w16sdtdh w16sdtfl w16du wp14">
+<w15:people xmlns:wpc="http://schemas.microsoft.com/office/word/2010/wordprocessingCanvas" xmlns:cx="http://schemas.microsoft.com/office/drawing/2014/chartex" xmlns:cx1="http://schemas.microsoft.com/office/drawing/2015/9/8/chartex" xmlns:cx2="http://schemas.microsoft.com/office/drawing/2015/10/21/chartex" xmlns:cx3="http://schemas.microsoft.com/office/drawing/2016/5/9/chartex" xmlns:cx4="http://schemas.microsoft.com/office/drawing/2016/5/10/chartex" xmlns:cx5="http://schemas.microsoft.com/office/drawing/2016/5/11/chartex" xmlns:cx6="http://schemas.microsoft.com/office/drawing/2016/5/12/chartex" xmlns:cx7="http://schemas.microsoft.com/office/drawing/2016/5/13/chartex" xmlns:cx8="http://schemas.microsoft.com/office/drawing/2016/5/14/chartex" xmlns:mc="http://schemas.openxmlformats.org/markup-compatibility/2006" xmlns:aink="http://schemas.microsoft.com/office/drawing/2016/ink" xmlns:am3d="http://schemas.microsoft.com/office/drawing/2017/model3d" xmlns:o="urn:schemas-microsoft-com:office:office" xmlns:oel="http://schemas.microsoft.com/office/2019/extlst" xmlns:r="http://schemas.openxmlformats.org/officeDocument/2006/relationships" xmlns:m="http://schemas.openxmlformats.org/officeDocument/2006/math" xmlns:v="urn:schemas-microsoft-com:vml" xmlns:wp14="http://schemas.microsoft.com/office/word/2010/wordprocessingDrawing" xmlns:wp="http://schemas.openxmlformats.org/drawingml/2006/wordprocessingDrawing" xmlns:w10="urn:schemas-microsoft-com:office:word" xmlns:w="http://schemas.openxmlformats.org/wordprocessingml/2006/main" xmlns:w14="http://schemas.microsoft.com/office/word/2010/wordml" xmlns:w15="http://schemas.microsoft.com/office/word/2012/wordml" xmlns:w16cei="http://schemas.microsoft.com/office/word/2026/wordml/cei" xmlns:w16cex="http://schemas.microsoft.com/office/word/2018/wordml/cex" xmlns:w16cid="http://schemas.microsoft.com/office/word/2016/wordml/cid" xmlns:w16="http://schemas.microsoft.com/office/word/2018/wordml" xmlns:w16du="http://schemas.microsoft.com/office/word/2023/wordml/word16du" xmlns:w16sdtdh="http://schemas.microsoft.com/office/word/2020/wordml/sdtdatahash" xmlns:w16sdtfl="http://schemas.microsoft.com/office/word/2024/wordml/sdtformatlock" xmlns:w16se="http://schemas.microsoft.com/office/word/2015/wordml/symex" xmlns:wpg="http://schemas.microsoft.com/office/word/2010/wordprocessingGroup" xmlns:wpi="http://schemas.microsoft.com/office/word/2010/wordprocessingInk" xmlns:wne="http://schemas.microsoft.com/office/word/2006/wordml" xmlns:wps="http://schemas.microsoft.com/office/word/2010/wordprocessingShape" mc:Ignorable="w14 w15 w16se w16cid w16 w16cex w16sdtdh w16sdtfl w16du wp14">
   <w15:person w15:author="Kendra Dickinson">
     <w15:presenceInfo w15:providerId="AD" w15:userId="S::kd866@spanport.rutgers.edu::453a5979-f629-47c6-b178-c7feeb10dddc"/>
   </w15:person>
@@ -3484,7 +3652,6 @@
   <w:style w:type="character" w:default="1" w:styleId="DefaultParagraphFont">
     <w:name w:val="Default Paragraph Font"/>
     <w:uiPriority w:val="1"/>
-    <w:semiHidden/>
     <w:unhideWhenUsed/>
   </w:style>
   <w:style w:type="table" w:default="1" w:styleId="TableNormal">
@@ -3925,6 +4092,29 @@
       <w:szCs w:val="20"/>
     </w:rPr>
   </w:style>
+  <w:style w:type="character" w:styleId="Hyperlink">
+    <w:name w:val="Hyperlink"/>
+    <w:basedOn w:val="DefaultParagraphFont"/>
+    <w:uiPriority w:val="99"/>
+    <w:unhideWhenUsed/>
+    <w:rsid w:val="008C1C6B"/>
+    <w:rPr>
+      <w:color w:val="467886" w:themeColor="hyperlink"/>
+      <w:u w:val="single"/>
+    </w:rPr>
+  </w:style>
+  <w:style w:type="character" w:styleId="UnresolvedMention">
+    <w:name w:val="Unresolved Mention"/>
+    <w:basedOn w:val="DefaultParagraphFont"/>
+    <w:uiPriority w:val="99"/>
+    <w:semiHidden/>
+    <w:unhideWhenUsed/>
+    <w:rsid w:val="008C1C6B"/>
+    <w:rPr>
+      <w:color w:val="605E5C"/>
+      <w:shd w:val="clear" w:color="auto" w:fill="E1DFDD"/>
+    </w:rPr>
+  </w:style>
 </w:styles>
 </file>
 

</xml_diff>